<commit_message>
docs: agregar checklist integral de evaluacion de software y actualizar indice documental
</commit_message>
<xml_diff>
--- a/docs/README.docx
+++ b/docs/README.docx
@@ -126,19 +126,25 @@
         </w:rPr>
         <w:t>docs/</w:t>
         <w:br/>
-        <w:t>├── INFORME_FINAL_APF2_LEOFIT.pdf       # Entregable Oficial Maestro APF2 (PDF)</w:t>
+        <w:t>├── Entregables Oficiales Consolidados:</w:t>
         <w:br/>
-        <w:t>├── INFORME_FINAL_APF2_LEOFIT.docx      # Entregable Oficial Maestro APF2 (Word)</w:t>
+        <w:t>│   ├── INFORME_FINAL_APF2_LEOFIT.pdf       # Entregable Oficial Maestro APF2 (PDF)</w:t>
         <w:br/>
-        <w:t>├── INFORME_FINAL_APF1_LEOFIT.pdf       # Entregable Oficial Maestro APF1 (PDF - Calificación: 18/20)</w:t>
+        <w:t>│   ├── INFORME_FINAL_APF2_LEOFIT.docx      # Entregable Oficial Maestro APF2 (Word)</w:t>
         <w:br/>
-        <w:t>├── INFORME_FINAL_APF1_LEOFIT.docx      # Entregable Oficial Maestro APF1 (Word)</w:t>
+        <w:t>│   ├── INFORME_FINAL_APF1_LEOFIT.pdf       # Entregable Oficial Maestro APF1 (PDF - Calificación: 18/20)</w:t>
+        <w:br/>
+        <w:t>│   └── INFORME_FINAL_APF1_LEOFIT.docx      # Entregable Oficial Maestro APF1 (Word)</w:t>
         <w:br/>
         <w:t>│</w:t>
         <w:br/>
-        <w:t>├── GUIA_CARGA_ISSUES_GITHUB.md         # Guía Maestra del Tablero GitHub Projects (Sprints 1 al 5)</w:t>
+        <w:t>├── Instrumentos de Evaluación y Gobernanza:</w:t>
         <w:br/>
-        <w:t>├── PLAN_ACADEMICO_GITHUB_PROJECTS.md   # Plan de Evaluaciones, RACI y Fórmulas UTP</w:t>
+        <w:t>│   ├── Checklist_Integral_Evaluacion_Software.md / .docx / .pdf  # Checklist Integral UTP (Funcionalidad, UX, Rendimiento, Seguridad)</w:t>
+        <w:br/>
+        <w:t>│   ├── GUIA_CARGA_ISSUES_GITHUB.md / .docx / .pdf               # Guía Maestra del Tablero GitHub Projects (Sprints 1 al 5)</w:t>
+        <w:br/>
+        <w:t>│   └── PLAN_ACADEMICO_GITHUB_PROJECTS_LEOFIT.md / .docx / .pdf   # Plan de Evaluaciones, RACI y Fórmulas UTP</w:t>
         <w:br/>
         <w:t>│</w:t>
         <w:br/>
@@ -152,7 +158,15 @@
         <w:br/>
         <w:t>│   ├── evaluaciones/                   # Retroalimentación oficial de notas UTP</w:t>
         <w:br/>
-        <w:t>│   └── recursos/                       # Plantillas institucionales y ficha de mapeo</w:t>
+        <w:t>│   └── recursos/                       # Plantillas institucionales y recursos UTP:</w:t>
+        <w:br/>
+        <w:t>│       ├── Checklist_Integral_Evaluacion_Software_Plantilla.docx # Plantilla base de evaluación de software</w:t>
+        <w:br/>
+        <w:t>│       ├── Ficha_Mapeo_Empresa_Semana_1.pdf                      # Ficha de mapeo empresarial</w:t>
+        <w:br/>
+        <w:t>│       ├── UTP_Semana_2_ASIS_TOBE_Plantilla.pptx                 # Plantilla de diagramas AS-IS / TO-BE</w:t>
+        <w:br/>
+        <w:t>│       └── UTP_Semana_2_Requerimientos_Plantilla.xlsx            # Matriz de requerimientos</w:t>
         <w:br/>
         <w:t>│</w:t>
         <w:br/>
@@ -176,11 +190,53 @@
         <w:br/>
         <w:t xml:space="preserve">    ├── 09_Guion_Video_Demo_Remotion    # Guion técnico y código de video demo</w:t>
         <w:br/>
-        <w:t xml:space="preserve">    ├── 10_Catalogo_Controles_Seguridad_OWASP.md # Matriz de mitigación OWASP Top 10</w:t>
+        <w:t xml:space="preserve">    ├── 10_Catalogo_Controles_Seguridad_OWASP # Matriz de mitigación OWASP Top 10</w:t>
         <w:br/>
-        <w:t xml:space="preserve">    ├── 11_Informe_Seguridad_Cifrado_Pruebas_Web.md # Reporte técnico SAST/DAST y Cifrado</w:t>
+        <w:t xml:space="preserve">    ├── 11_Informe_Seguridad_Cifrado_Pruebas_Web # Reporte técnico SAST/DAST y Cifrado</w:t>
         <w:br/>
-        <w:t xml:space="preserve">    └── 12_Manual_Despliegue_Cloud_Produccion.md    # Manual de Despliegue en Cloud v1</w:t>
+        <w:t xml:space="preserve">    └── 12_Manual_Despliegue_Cloud_Produccion    # Manual de Despliegue en Cloud v1</w:t>
+      </w:r>
+    </w:p>
+    <w:p>
+      <w:pPr>
+        <w:spacing w:before="40" w:after="80" w:line="276" w:lineRule="auto"/>
+      </w:pPr>
+      <w:r>
+        <w:rPr>
+          <w:rFonts w:ascii="Calibri" w:hAnsi="Calibri"/>
+          <w:color w:val="1E293B"/>
+          <w:sz w:val="22"/>
+        </w:rPr>
+        <w:t>&gt; [!NOTE]</w:t>
+      </w:r>
+    </w:p>
+    <w:p>
+      <w:pPr>
+        <w:spacing w:before="40" w:after="80" w:line="276" w:lineRule="auto"/>
+      </w:pPr>
+      <w:r>
+        <w:rPr>
+          <w:rFonts w:ascii="Calibri" w:hAnsi="Calibri"/>
+          <w:color w:val="1E293B"/>
+          <w:sz w:val="22"/>
+        </w:rPr>
+        <w:t>&gt; Para la entrega institucional en la plataforma académica, el archivo maestro consolidado de APF2 también se replica en [</w:t>
+      </w:r>
+      <w:r>
+        <w:rPr>
+          <w:rFonts w:ascii="Consolas" w:hAnsi="Consolas"/>
+          <w:color w:val="C2410C"/>
+          <w:sz w:val="19"/>
+        </w:rPr>
+        <w:t>Integrator/informe/DOCUMENTACION.docx</w:t>
+      </w:r>
+      <w:r>
+        <w:rPr>
+          <w:rFonts w:ascii="Calibri" w:hAnsi="Calibri"/>
+          <w:color w:val="1E293B"/>
+          <w:sz w:val="22"/>
+        </w:rPr>
+        <w:t>](../Integrator/informe/DOCUMENTACION.docx) conforme a la estructura requerida por el estándar de entrega de Curso Integrador II.</w:t>
       </w:r>
     </w:p>
     <w:p>
@@ -973,7 +1029,728 @@
           <w:color w:val="F97316"/>
           <w:sz w:val="28"/>
         </w:rPr>
-        <w:t>2. Módulos Temáticos de Ingeniería y Arquitectura</w:t>
+        <w:t>2. Instrumentos de Evaluación y Gobernanza Transversal</w:t>
+      </w:r>
+    </w:p>
+    <w:tbl>
+      <w:tblPr>
+        <w:tblW w:type="auto" w:w="0"/>
+        <w:jc w:val="center"/>
+        <w:tblLook w:firstColumn="1" w:firstRow="1" w:lastColumn="0" w:lastRow="0" w:noHBand="0" w:noVBand="1" w:val="04A0"/>
+      </w:tblPr>
+      <w:tblGrid>
+        <w:gridCol w:w="1872"/>
+        <w:gridCol w:w="1872"/>
+        <w:gridCol w:w="1872"/>
+        <w:gridCol w:w="1872"/>
+        <w:gridCol w:w="1872"/>
+      </w:tblGrid>
+      <w:tr>
+        <w:trPr>
+          <w:trHeight w:val="280"/>
+        </w:trPr>
+        <w:tc>
+          <w:tcPr>
+            <w:tcW w:type="dxa" w:w="1872"/>
+            <w:vAlign w:val="center"/>
+            <w:tcMar>
+              <w:top w:w="120" w:type="dxa"/>
+              <w:bottom w:w="120" w:type="dxa"/>
+              <w:left w:w="150" w:type="dxa"/>
+              <w:right w:w="150" w:type="dxa"/>
+            </w:tcMar>
+            <w:shd w:fill="0F172A"/>
+          </w:tcPr>
+          <w:p>
+            <w:pPr>
+              <w:spacing w:before="0" w:after="0" w:line="276" w:lineRule="auto"/>
+            </w:pPr>
+            <w:r>
+              <w:rPr>
+                <w:rFonts w:ascii="Calibri" w:hAnsi="Calibri"/>
+                <w:b/>
+                <w:color w:val="FFFFFF"/>
+                <w:sz w:val="20"/>
+              </w:rPr>
+              <w:t>Documento</w:t>
+            </w:r>
+          </w:p>
+        </w:tc>
+        <w:tc>
+          <w:tcPr>
+            <w:tcW w:type="dxa" w:w="1872"/>
+            <w:vAlign w:val="center"/>
+            <w:tcMar>
+              <w:top w:w="120" w:type="dxa"/>
+              <w:bottom w:w="120" w:type="dxa"/>
+              <w:left w:w="150" w:type="dxa"/>
+              <w:right w:w="150" w:type="dxa"/>
+            </w:tcMar>
+            <w:shd w:fill="0F172A"/>
+          </w:tcPr>
+          <w:p>
+            <w:pPr>
+              <w:spacing w:before="0" w:after="0" w:line="276" w:lineRule="auto"/>
+            </w:pPr>
+            <w:r>
+              <w:rPr>
+                <w:rFonts w:ascii="Calibri" w:hAnsi="Calibri"/>
+                <w:b/>
+                <w:color w:val="FFFFFF"/>
+                <w:sz w:val="20"/>
+              </w:rPr>
+              <w:t>Formato MD</w:t>
+            </w:r>
+          </w:p>
+        </w:tc>
+        <w:tc>
+          <w:tcPr>
+            <w:tcW w:type="dxa" w:w="1872"/>
+            <w:vAlign w:val="center"/>
+            <w:tcMar>
+              <w:top w:w="120" w:type="dxa"/>
+              <w:bottom w:w="120" w:type="dxa"/>
+              <w:left w:w="150" w:type="dxa"/>
+              <w:right w:w="150" w:type="dxa"/>
+            </w:tcMar>
+            <w:shd w:fill="0F172A"/>
+          </w:tcPr>
+          <w:p>
+            <w:pPr>
+              <w:spacing w:before="0" w:after="0" w:line="276" w:lineRule="auto"/>
+            </w:pPr>
+            <w:r>
+              <w:rPr>
+                <w:rFonts w:ascii="Calibri" w:hAnsi="Calibri"/>
+                <w:b/>
+                <w:color w:val="FFFFFF"/>
+                <w:sz w:val="20"/>
+              </w:rPr>
+              <w:t>Formato DOCX</w:t>
+            </w:r>
+          </w:p>
+        </w:tc>
+        <w:tc>
+          <w:tcPr>
+            <w:tcW w:type="dxa" w:w="1872"/>
+            <w:vAlign w:val="center"/>
+            <w:tcMar>
+              <w:top w:w="120" w:type="dxa"/>
+              <w:bottom w:w="120" w:type="dxa"/>
+              <w:left w:w="150" w:type="dxa"/>
+              <w:right w:w="150" w:type="dxa"/>
+            </w:tcMar>
+            <w:shd w:fill="0F172A"/>
+          </w:tcPr>
+          <w:p>
+            <w:pPr>
+              <w:spacing w:before="0" w:after="0" w:line="276" w:lineRule="auto"/>
+            </w:pPr>
+            <w:r>
+              <w:rPr>
+                <w:rFonts w:ascii="Calibri" w:hAnsi="Calibri"/>
+                <w:b/>
+                <w:color w:val="FFFFFF"/>
+                <w:sz w:val="20"/>
+              </w:rPr>
+              <w:t>Formato PDF</w:t>
+            </w:r>
+          </w:p>
+        </w:tc>
+        <w:tc>
+          <w:tcPr>
+            <w:tcW w:type="dxa" w:w="1872"/>
+            <w:vAlign w:val="center"/>
+            <w:tcMar>
+              <w:top w:w="120" w:type="dxa"/>
+              <w:bottom w:w="120" w:type="dxa"/>
+              <w:left w:w="150" w:type="dxa"/>
+              <w:right w:w="150" w:type="dxa"/>
+            </w:tcMar>
+            <w:shd w:fill="0F172A"/>
+          </w:tcPr>
+          <w:p>
+            <w:pPr>
+              <w:spacing w:before="0" w:after="0" w:line="276" w:lineRule="auto"/>
+            </w:pPr>
+            <w:r>
+              <w:rPr>
+                <w:rFonts w:ascii="Calibri" w:hAnsi="Calibri"/>
+                <w:b/>
+                <w:color w:val="FFFFFF"/>
+                <w:sz w:val="20"/>
+              </w:rPr>
+              <w:t>Descripción</w:t>
+            </w:r>
+          </w:p>
+        </w:tc>
+      </w:tr>
+      <w:tr>
+        <w:trPr>
+          <w:trHeight w:val="280"/>
+        </w:trPr>
+        <w:tc>
+          <w:tcPr>
+            <w:tcW w:type="dxa" w:w="1872"/>
+            <w:vAlign w:val="center"/>
+            <w:tcMar>
+              <w:top w:w="120" w:type="dxa"/>
+              <w:bottom w:w="120" w:type="dxa"/>
+              <w:left w:w="150" w:type="dxa"/>
+              <w:right w:w="150" w:type="dxa"/>
+            </w:tcMar>
+            <w:shd w:fill="F8FAFC"/>
+          </w:tcPr>
+          <w:p>
+            <w:pPr>
+              <w:spacing w:before="0" w:after="0" w:line="276" w:lineRule="auto"/>
+            </w:pPr>
+            <w:r>
+              <w:rPr>
+                <w:rFonts w:ascii="Calibri" w:hAnsi="Calibri"/>
+                <w:b/>
+                <w:color w:val="1E293B"/>
+                <w:sz w:val="19"/>
+              </w:rPr>
+              <w:t>Checklist Integral de Evaluación</w:t>
+            </w:r>
+          </w:p>
+        </w:tc>
+        <w:tc>
+          <w:tcPr>
+            <w:tcW w:type="dxa" w:w="1872"/>
+            <w:vAlign w:val="center"/>
+            <w:tcMar>
+              <w:top w:w="120" w:type="dxa"/>
+              <w:bottom w:w="120" w:type="dxa"/>
+              <w:left w:w="150" w:type="dxa"/>
+              <w:right w:w="150" w:type="dxa"/>
+            </w:tcMar>
+            <w:shd w:fill="F8FAFC"/>
+          </w:tcPr>
+          <w:p>
+            <w:pPr>
+              <w:spacing w:before="0" w:after="0" w:line="276" w:lineRule="auto"/>
+            </w:pPr>
+            <w:r>
+              <w:rPr>
+                <w:rFonts w:ascii="Calibri" w:hAnsi="Calibri"/>
+                <w:color w:val="1E293B"/>
+                <w:sz w:val="19"/>
+              </w:rPr>
+              <w:t>[</w:t>
+            </w:r>
+            <w:r>
+              <w:rPr>
+                <w:rFonts w:ascii="Consolas" w:hAnsi="Consolas"/>
+                <w:color w:val="C2410C"/>
+                <w:sz w:val="19"/>
+              </w:rPr>
+              <w:t>MD</w:t>
+            </w:r>
+            <w:r>
+              <w:rPr>
+                <w:rFonts w:ascii="Calibri" w:hAnsi="Calibri"/>
+                <w:color w:val="1E293B"/>
+                <w:sz w:val="19"/>
+              </w:rPr>
+              <w:t>](Checklist_Integral_Evaluacion_Software.md)</w:t>
+            </w:r>
+          </w:p>
+        </w:tc>
+        <w:tc>
+          <w:tcPr>
+            <w:tcW w:type="dxa" w:w="1872"/>
+            <w:vAlign w:val="center"/>
+            <w:tcMar>
+              <w:top w:w="120" w:type="dxa"/>
+              <w:bottom w:w="120" w:type="dxa"/>
+              <w:left w:w="150" w:type="dxa"/>
+              <w:right w:w="150" w:type="dxa"/>
+            </w:tcMar>
+            <w:shd w:fill="F8FAFC"/>
+          </w:tcPr>
+          <w:p>
+            <w:pPr>
+              <w:spacing w:before="0" w:after="0" w:line="276" w:lineRule="auto"/>
+            </w:pPr>
+            <w:r>
+              <w:rPr>
+                <w:rFonts w:ascii="Calibri" w:hAnsi="Calibri"/>
+                <w:color w:val="1E293B"/>
+                <w:sz w:val="19"/>
+              </w:rPr>
+              <w:t>[</w:t>
+            </w:r>
+            <w:r>
+              <w:rPr>
+                <w:rFonts w:ascii="Consolas" w:hAnsi="Consolas"/>
+                <w:color w:val="C2410C"/>
+                <w:sz w:val="19"/>
+              </w:rPr>
+              <w:t>DOCX</w:t>
+            </w:r>
+            <w:r>
+              <w:rPr>
+                <w:rFonts w:ascii="Calibri" w:hAnsi="Calibri"/>
+                <w:color w:val="1E293B"/>
+                <w:sz w:val="19"/>
+              </w:rPr>
+              <w:t>](Checklist_Integral_Evaluacion_Software.docx)</w:t>
+            </w:r>
+          </w:p>
+        </w:tc>
+        <w:tc>
+          <w:tcPr>
+            <w:tcW w:type="dxa" w:w="1872"/>
+            <w:vAlign w:val="center"/>
+            <w:tcMar>
+              <w:top w:w="120" w:type="dxa"/>
+              <w:bottom w:w="120" w:type="dxa"/>
+              <w:left w:w="150" w:type="dxa"/>
+              <w:right w:w="150" w:type="dxa"/>
+            </w:tcMar>
+            <w:shd w:fill="F8FAFC"/>
+          </w:tcPr>
+          <w:p>
+            <w:pPr>
+              <w:spacing w:before="0" w:after="0" w:line="276" w:lineRule="auto"/>
+            </w:pPr>
+            <w:r>
+              <w:rPr>
+                <w:rFonts w:ascii="Calibri" w:hAnsi="Calibri"/>
+                <w:color w:val="1E293B"/>
+                <w:sz w:val="19"/>
+              </w:rPr>
+              <w:t>[</w:t>
+            </w:r>
+            <w:r>
+              <w:rPr>
+                <w:rFonts w:ascii="Consolas" w:hAnsi="Consolas"/>
+                <w:color w:val="C2410C"/>
+                <w:sz w:val="19"/>
+              </w:rPr>
+              <w:t>PDF</w:t>
+            </w:r>
+            <w:r>
+              <w:rPr>
+                <w:rFonts w:ascii="Calibri" w:hAnsi="Calibri"/>
+                <w:color w:val="1E293B"/>
+                <w:sz w:val="19"/>
+              </w:rPr>
+              <w:t>](Checklist_Integral_Evaluacion_Software.pdf)</w:t>
+            </w:r>
+          </w:p>
+        </w:tc>
+        <w:tc>
+          <w:tcPr>
+            <w:tcW w:type="dxa" w:w="1872"/>
+            <w:vAlign w:val="center"/>
+            <w:tcMar>
+              <w:top w:w="120" w:type="dxa"/>
+              <w:bottom w:w="120" w:type="dxa"/>
+              <w:left w:w="150" w:type="dxa"/>
+              <w:right w:w="150" w:type="dxa"/>
+            </w:tcMar>
+            <w:shd w:fill="F8FAFC"/>
+          </w:tcPr>
+          <w:p>
+            <w:pPr>
+              <w:spacing w:before="0" w:after="0" w:line="276" w:lineRule="auto"/>
+            </w:pPr>
+            <w:r>
+              <w:rPr>
+                <w:rFonts w:ascii="Calibri" w:hAnsi="Calibri"/>
+                <w:color w:val="1E293B"/>
+                <w:sz w:val="19"/>
+              </w:rPr>
+              <w:t>Evaluación técnica exhaustiva (Funcionalidad, Usabilidad UX, Rendimiento y Seguridad/Costos).</w:t>
+            </w:r>
+          </w:p>
+        </w:tc>
+      </w:tr>
+      <w:tr>
+        <w:trPr>
+          <w:trHeight w:val="280"/>
+        </w:trPr>
+        <w:tc>
+          <w:tcPr>
+            <w:tcW w:type="dxa" w:w="1872"/>
+            <w:vAlign w:val="center"/>
+            <w:tcMar>
+              <w:top w:w="120" w:type="dxa"/>
+              <w:bottom w:w="120" w:type="dxa"/>
+              <w:left w:w="150" w:type="dxa"/>
+              <w:right w:w="150" w:type="dxa"/>
+            </w:tcMar>
+          </w:tcPr>
+          <w:p>
+            <w:pPr>
+              <w:spacing w:before="0" w:after="0" w:line="276" w:lineRule="auto"/>
+            </w:pPr>
+            <w:r>
+              <w:rPr>
+                <w:rFonts w:ascii="Calibri" w:hAnsi="Calibri"/>
+                <w:b/>
+                <w:color w:val="1E293B"/>
+                <w:sz w:val="19"/>
+              </w:rPr>
+              <w:t>Guía de Carga de Issues GitHub</w:t>
+            </w:r>
+          </w:p>
+        </w:tc>
+        <w:tc>
+          <w:tcPr>
+            <w:tcW w:type="dxa" w:w="1872"/>
+            <w:vAlign w:val="center"/>
+            <w:tcMar>
+              <w:top w:w="120" w:type="dxa"/>
+              <w:bottom w:w="120" w:type="dxa"/>
+              <w:left w:w="150" w:type="dxa"/>
+              <w:right w:w="150" w:type="dxa"/>
+            </w:tcMar>
+          </w:tcPr>
+          <w:p>
+            <w:pPr>
+              <w:spacing w:before="0" w:after="0" w:line="276" w:lineRule="auto"/>
+            </w:pPr>
+            <w:r>
+              <w:rPr>
+                <w:rFonts w:ascii="Calibri" w:hAnsi="Calibri"/>
+                <w:color w:val="1E293B"/>
+                <w:sz w:val="19"/>
+              </w:rPr>
+              <w:t>[</w:t>
+            </w:r>
+            <w:r>
+              <w:rPr>
+                <w:rFonts w:ascii="Consolas" w:hAnsi="Consolas"/>
+                <w:color w:val="C2410C"/>
+                <w:sz w:val="19"/>
+              </w:rPr>
+              <w:t>MD</w:t>
+            </w:r>
+            <w:r>
+              <w:rPr>
+                <w:rFonts w:ascii="Calibri" w:hAnsi="Calibri"/>
+                <w:color w:val="1E293B"/>
+                <w:sz w:val="19"/>
+              </w:rPr>
+              <w:t>](GUIA_CARGA_ISSUES_GITHUB.md)</w:t>
+            </w:r>
+          </w:p>
+        </w:tc>
+        <w:tc>
+          <w:tcPr>
+            <w:tcW w:type="dxa" w:w="1872"/>
+            <w:vAlign w:val="center"/>
+            <w:tcMar>
+              <w:top w:w="120" w:type="dxa"/>
+              <w:bottom w:w="120" w:type="dxa"/>
+              <w:left w:w="150" w:type="dxa"/>
+              <w:right w:w="150" w:type="dxa"/>
+            </w:tcMar>
+          </w:tcPr>
+          <w:p>
+            <w:pPr>
+              <w:spacing w:before="0" w:after="0" w:line="276" w:lineRule="auto"/>
+            </w:pPr>
+            <w:r>
+              <w:rPr>
+                <w:rFonts w:ascii="Calibri" w:hAnsi="Calibri"/>
+                <w:color w:val="1E293B"/>
+                <w:sz w:val="19"/>
+              </w:rPr>
+              <w:t>[</w:t>
+            </w:r>
+            <w:r>
+              <w:rPr>
+                <w:rFonts w:ascii="Consolas" w:hAnsi="Consolas"/>
+                <w:color w:val="C2410C"/>
+                <w:sz w:val="19"/>
+              </w:rPr>
+              <w:t>DOCX</w:t>
+            </w:r>
+            <w:r>
+              <w:rPr>
+                <w:rFonts w:ascii="Calibri" w:hAnsi="Calibri"/>
+                <w:color w:val="1E293B"/>
+                <w:sz w:val="19"/>
+              </w:rPr>
+              <w:t>](GUIA_CARGA_ISSUES_GITHUB.docx)</w:t>
+            </w:r>
+          </w:p>
+        </w:tc>
+        <w:tc>
+          <w:tcPr>
+            <w:tcW w:type="dxa" w:w="1872"/>
+            <w:vAlign w:val="center"/>
+            <w:tcMar>
+              <w:top w:w="120" w:type="dxa"/>
+              <w:bottom w:w="120" w:type="dxa"/>
+              <w:left w:w="150" w:type="dxa"/>
+              <w:right w:w="150" w:type="dxa"/>
+            </w:tcMar>
+          </w:tcPr>
+          <w:p>
+            <w:pPr>
+              <w:spacing w:before="0" w:after="0" w:line="276" w:lineRule="auto"/>
+            </w:pPr>
+            <w:r>
+              <w:rPr>
+                <w:rFonts w:ascii="Calibri" w:hAnsi="Calibri"/>
+                <w:color w:val="1E293B"/>
+                <w:sz w:val="19"/>
+              </w:rPr>
+              <w:t>[</w:t>
+            </w:r>
+            <w:r>
+              <w:rPr>
+                <w:rFonts w:ascii="Consolas" w:hAnsi="Consolas"/>
+                <w:color w:val="C2410C"/>
+                <w:sz w:val="19"/>
+              </w:rPr>
+              <w:t>PDF</w:t>
+            </w:r>
+            <w:r>
+              <w:rPr>
+                <w:rFonts w:ascii="Calibri" w:hAnsi="Calibri"/>
+                <w:color w:val="1E293B"/>
+                <w:sz w:val="19"/>
+              </w:rPr>
+              <w:t>](GUIA_CARGA_ISSUES_GITHUB.pdf)</w:t>
+            </w:r>
+          </w:p>
+        </w:tc>
+        <w:tc>
+          <w:tcPr>
+            <w:tcW w:type="dxa" w:w="1872"/>
+            <w:vAlign w:val="center"/>
+            <w:tcMar>
+              <w:top w:w="120" w:type="dxa"/>
+              <w:bottom w:w="120" w:type="dxa"/>
+              <w:left w:w="150" w:type="dxa"/>
+              <w:right w:w="150" w:type="dxa"/>
+            </w:tcMar>
+          </w:tcPr>
+          <w:p>
+            <w:pPr>
+              <w:spacing w:before="0" w:after="0" w:line="276" w:lineRule="auto"/>
+            </w:pPr>
+            <w:r>
+              <w:rPr>
+                <w:rFonts w:ascii="Calibri" w:hAnsi="Calibri"/>
+                <w:color w:val="1E293B"/>
+                <w:sz w:val="19"/>
+              </w:rPr>
+              <w:t>Guía de gestión ágil de sprints, backlog, tareas y trazabilidad de requerimientos.</w:t>
+            </w:r>
+          </w:p>
+        </w:tc>
+      </w:tr>
+      <w:tr>
+        <w:trPr>
+          <w:trHeight w:val="280"/>
+        </w:trPr>
+        <w:tc>
+          <w:tcPr>
+            <w:tcW w:type="dxa" w:w="1872"/>
+            <w:vAlign w:val="center"/>
+            <w:tcMar>
+              <w:top w:w="120" w:type="dxa"/>
+              <w:bottom w:w="120" w:type="dxa"/>
+              <w:left w:w="150" w:type="dxa"/>
+              <w:right w:w="150" w:type="dxa"/>
+            </w:tcMar>
+            <w:shd w:fill="F8FAFC"/>
+          </w:tcPr>
+          <w:p>
+            <w:pPr>
+              <w:spacing w:before="0" w:after="0" w:line="276" w:lineRule="auto"/>
+            </w:pPr>
+            <w:r>
+              <w:rPr>
+                <w:rFonts w:ascii="Calibri" w:hAnsi="Calibri"/>
+                <w:b/>
+                <w:color w:val="1E293B"/>
+                <w:sz w:val="19"/>
+              </w:rPr>
+              <w:t>Plan Académico GitHub Projects</w:t>
+            </w:r>
+          </w:p>
+        </w:tc>
+        <w:tc>
+          <w:tcPr>
+            <w:tcW w:type="dxa" w:w="1872"/>
+            <w:vAlign w:val="center"/>
+            <w:tcMar>
+              <w:top w:w="120" w:type="dxa"/>
+              <w:bottom w:w="120" w:type="dxa"/>
+              <w:left w:w="150" w:type="dxa"/>
+              <w:right w:w="150" w:type="dxa"/>
+            </w:tcMar>
+            <w:shd w:fill="F8FAFC"/>
+          </w:tcPr>
+          <w:p>
+            <w:pPr>
+              <w:spacing w:before="0" w:after="0" w:line="276" w:lineRule="auto"/>
+            </w:pPr>
+            <w:r>
+              <w:rPr>
+                <w:rFonts w:ascii="Calibri" w:hAnsi="Calibri"/>
+                <w:color w:val="1E293B"/>
+                <w:sz w:val="19"/>
+              </w:rPr>
+              <w:t>[</w:t>
+            </w:r>
+            <w:r>
+              <w:rPr>
+                <w:rFonts w:ascii="Consolas" w:hAnsi="Consolas"/>
+                <w:color w:val="C2410C"/>
+                <w:sz w:val="19"/>
+              </w:rPr>
+              <w:t>MD</w:t>
+            </w:r>
+            <w:r>
+              <w:rPr>
+                <w:rFonts w:ascii="Calibri" w:hAnsi="Calibri"/>
+                <w:color w:val="1E293B"/>
+                <w:sz w:val="19"/>
+              </w:rPr>
+              <w:t>](PLAN_ACADEMICO_GITHUB_PROJECTS_LEOFIT.md)</w:t>
+            </w:r>
+          </w:p>
+        </w:tc>
+        <w:tc>
+          <w:tcPr>
+            <w:tcW w:type="dxa" w:w="1872"/>
+            <w:vAlign w:val="center"/>
+            <w:tcMar>
+              <w:top w:w="120" w:type="dxa"/>
+              <w:bottom w:w="120" w:type="dxa"/>
+              <w:left w:w="150" w:type="dxa"/>
+              <w:right w:w="150" w:type="dxa"/>
+            </w:tcMar>
+            <w:shd w:fill="F8FAFC"/>
+          </w:tcPr>
+          <w:p>
+            <w:pPr>
+              <w:spacing w:before="0" w:after="0" w:line="276" w:lineRule="auto"/>
+            </w:pPr>
+            <w:r>
+              <w:rPr>
+                <w:rFonts w:ascii="Calibri" w:hAnsi="Calibri"/>
+                <w:color w:val="1E293B"/>
+                <w:sz w:val="19"/>
+              </w:rPr>
+              <w:t>[</w:t>
+            </w:r>
+            <w:r>
+              <w:rPr>
+                <w:rFonts w:ascii="Consolas" w:hAnsi="Consolas"/>
+                <w:color w:val="C2410C"/>
+                <w:sz w:val="19"/>
+              </w:rPr>
+              <w:t>DOCX</w:t>
+            </w:r>
+            <w:r>
+              <w:rPr>
+                <w:rFonts w:ascii="Calibri" w:hAnsi="Calibri"/>
+                <w:color w:val="1E293B"/>
+                <w:sz w:val="19"/>
+              </w:rPr>
+              <w:t>](PLAN_ACADEMICO_GITHUB_PROJECTS_LEOFIT.docx)</w:t>
+            </w:r>
+          </w:p>
+        </w:tc>
+        <w:tc>
+          <w:tcPr>
+            <w:tcW w:type="dxa" w:w="1872"/>
+            <w:vAlign w:val="center"/>
+            <w:tcMar>
+              <w:top w:w="120" w:type="dxa"/>
+              <w:bottom w:w="120" w:type="dxa"/>
+              <w:left w:w="150" w:type="dxa"/>
+              <w:right w:w="150" w:type="dxa"/>
+            </w:tcMar>
+            <w:shd w:fill="F8FAFC"/>
+          </w:tcPr>
+          <w:p>
+            <w:pPr>
+              <w:spacing w:before="0" w:after="0" w:line="276" w:lineRule="auto"/>
+            </w:pPr>
+            <w:r>
+              <w:rPr>
+                <w:rFonts w:ascii="Calibri" w:hAnsi="Calibri"/>
+                <w:color w:val="1E293B"/>
+                <w:sz w:val="19"/>
+              </w:rPr>
+              <w:t>[</w:t>
+            </w:r>
+            <w:r>
+              <w:rPr>
+                <w:rFonts w:ascii="Consolas" w:hAnsi="Consolas"/>
+                <w:color w:val="C2410C"/>
+                <w:sz w:val="19"/>
+              </w:rPr>
+              <w:t>PDF</w:t>
+            </w:r>
+            <w:r>
+              <w:rPr>
+                <w:rFonts w:ascii="Calibri" w:hAnsi="Calibri"/>
+                <w:color w:val="1E293B"/>
+                <w:sz w:val="19"/>
+              </w:rPr>
+              <w:t>](PLAN_ACADEMICO_GITHUB_PROJECTS_LEOFIT.pdf)</w:t>
+            </w:r>
+          </w:p>
+        </w:tc>
+        <w:tc>
+          <w:tcPr>
+            <w:tcW w:type="dxa" w:w="1872"/>
+            <w:vAlign w:val="center"/>
+            <w:tcMar>
+              <w:top w:w="120" w:type="dxa"/>
+              <w:bottom w:w="120" w:type="dxa"/>
+              <w:left w:w="150" w:type="dxa"/>
+              <w:right w:w="150" w:type="dxa"/>
+            </w:tcMar>
+            <w:shd w:fill="F8FAFC"/>
+          </w:tcPr>
+          <w:p>
+            <w:pPr>
+              <w:spacing w:before="0" w:after="0" w:line="276" w:lineRule="auto"/>
+            </w:pPr>
+            <w:r>
+              <w:rPr>
+                <w:rFonts w:ascii="Calibri" w:hAnsi="Calibri"/>
+                <w:color w:val="1E293B"/>
+                <w:sz w:val="19"/>
+              </w:rPr>
+              <w:t>Plan de hitos académicos, matriz de responsabilidades RACI y ponderaciones UTP.</w:t>
+            </w:r>
+          </w:p>
+        </w:tc>
+      </w:tr>
+    </w:tbl>
+    <w:p>
+      <w:pPr>
+        <w:spacing w:before="0" w:after="120"/>
+      </w:pPr>
+    </w:p>
+    <w:p>
+      <w:pPr>
+        <w:keepNext/>
+        <w:spacing w:before="280" w:after="80"/>
+      </w:pPr>
+      <w:r>
+        <w:rPr>
+          <w:rFonts w:ascii="Calibri" w:hAnsi="Calibri"/>
+          <w:b/>
+          <w:color w:val="F97316"/>
+          <w:sz w:val="28"/>
+        </w:rPr>
+        <w:t>3. Módulos Temáticos de Ingeniería y Arquitectura</w:t>
       </w:r>
     </w:p>
     <w:tbl>
@@ -3150,7 +3927,23 @@
                 <w:color w:val="1E293B"/>
                 <w:sz w:val="19"/>
               </w:rPr>
-              <w:t>—</w:t>
+              <w:t>[</w:t>
+            </w:r>
+            <w:r>
+              <w:rPr>
+                <w:rFonts w:ascii="Consolas" w:hAnsi="Consolas"/>
+                <w:color w:val="C2410C"/>
+                <w:sz w:val="19"/>
+              </w:rPr>
+              <w:t>DOCX</w:t>
+            </w:r>
+            <w:r>
+              <w:rPr>
+                <w:rFonts w:ascii="Calibri" w:hAnsi="Calibri"/>
+                <w:color w:val="1E293B"/>
+                <w:sz w:val="19"/>
+              </w:rPr>
+              <w:t>](10_Catalogo_Controles_Seguridad_OWASP.docx)</w:t>
             </w:r>
           </w:p>
         </w:tc>
@@ -3175,7 +3968,23 @@
                 <w:color w:val="1E293B"/>
                 <w:sz w:val="19"/>
               </w:rPr>
-              <w:t>—</w:t>
+              <w:t>[</w:t>
+            </w:r>
+            <w:r>
+              <w:rPr>
+                <w:rFonts w:ascii="Consolas" w:hAnsi="Consolas"/>
+                <w:color w:val="C2410C"/>
+                <w:sz w:val="19"/>
+              </w:rPr>
+              <w:t>PDF</w:t>
+            </w:r>
+            <w:r>
+              <w:rPr>
+                <w:rFonts w:ascii="Calibri" w:hAnsi="Calibri"/>
+                <w:color w:val="1E293B"/>
+                <w:sz w:val="19"/>
+              </w:rPr>
+              <w:t>](10_Catalogo_Controles_Seguridad_OWASP.pdf)</w:t>
             </w:r>
           </w:p>
         </w:tc>
@@ -3327,7 +4136,23 @@
                 <w:color w:val="1E293B"/>
                 <w:sz w:val="19"/>
               </w:rPr>
-              <w:t>—</w:t>
+              <w:t>[</w:t>
+            </w:r>
+            <w:r>
+              <w:rPr>
+                <w:rFonts w:ascii="Consolas" w:hAnsi="Consolas"/>
+                <w:color w:val="C2410C"/>
+                <w:sz w:val="19"/>
+              </w:rPr>
+              <w:t>DOCX</w:t>
+            </w:r>
+            <w:r>
+              <w:rPr>
+                <w:rFonts w:ascii="Calibri" w:hAnsi="Calibri"/>
+                <w:color w:val="1E293B"/>
+                <w:sz w:val="19"/>
+              </w:rPr>
+              <w:t>](11_Informe_Seguridad_Cifrado_Pruebas_Web.docx)</w:t>
             </w:r>
           </w:p>
         </w:tc>
@@ -3353,7 +4178,23 @@
                 <w:color w:val="1E293B"/>
                 <w:sz w:val="19"/>
               </w:rPr>
-              <w:t>—</w:t>
+              <w:t>[</w:t>
+            </w:r>
+            <w:r>
+              <w:rPr>
+                <w:rFonts w:ascii="Consolas" w:hAnsi="Consolas"/>
+                <w:color w:val="C2410C"/>
+                <w:sz w:val="19"/>
+              </w:rPr>
+              <w:t>PDF</w:t>
+            </w:r>
+            <w:r>
+              <w:rPr>
+                <w:rFonts w:ascii="Calibri" w:hAnsi="Calibri"/>
+                <w:color w:val="1E293B"/>
+                <w:sz w:val="19"/>
+              </w:rPr>
+              <w:t>](11_Informe_Seguridad_Cifrado_Pruebas_Web.pdf)</w:t>
             </w:r>
           </w:p>
         </w:tc>
@@ -3518,7 +4359,23 @@
                 <w:color w:val="1E293B"/>
                 <w:sz w:val="19"/>
               </w:rPr>
-              <w:t>—</w:t>
+              <w:t>[</w:t>
+            </w:r>
+            <w:r>
+              <w:rPr>
+                <w:rFonts w:ascii="Consolas" w:hAnsi="Consolas"/>
+                <w:color w:val="C2410C"/>
+                <w:sz w:val="19"/>
+              </w:rPr>
+              <w:t>DOCX</w:t>
+            </w:r>
+            <w:r>
+              <w:rPr>
+                <w:rFonts w:ascii="Calibri" w:hAnsi="Calibri"/>
+                <w:color w:val="1E293B"/>
+                <w:sz w:val="19"/>
+              </w:rPr>
+              <w:t>](12_Manual_Despliegue_Cloud_Produccion.docx)</w:t>
             </w:r>
           </w:p>
         </w:tc>
@@ -3543,7 +4400,23 @@
                 <w:color w:val="1E293B"/>
                 <w:sz w:val="19"/>
               </w:rPr>
-              <w:t>—</w:t>
+              <w:t>[</w:t>
+            </w:r>
+            <w:r>
+              <w:rPr>
+                <w:rFonts w:ascii="Consolas" w:hAnsi="Consolas"/>
+                <w:color w:val="C2410C"/>
+                <w:sz w:val="19"/>
+              </w:rPr>
+              <w:t>PDF</w:t>
+            </w:r>
+            <w:r>
+              <w:rPr>
+                <w:rFonts w:ascii="Calibri" w:hAnsi="Calibri"/>
+                <w:color w:val="1E293B"/>
+                <w:sz w:val="19"/>
+              </w:rPr>
+              <w:t>](12_Manual_Despliegue_Cloud_Produccion.pdf)</w:t>
             </w:r>
           </w:p>
         </w:tc>

</xml_diff>

<commit_message>
docs: agregar informe formal de evidencias de requerimientos con capturas de pantalla, docx y pdf
</commit_message>
<xml_diff>
--- a/docs/README.docx
+++ b/docs/README.docx
@@ -194,7 +194,9 @@
         <w:br/>
         <w:t xml:space="preserve">    ├── 11_Informe_Seguridad_Cifrado_Pruebas_Web # Reporte técnico SAST/DAST y Cifrado</w:t>
         <w:br/>
-        <w:t xml:space="preserve">    └── 12_Manual_Despliegue_Cloud_Produccion    # Manual de Despliegue en Cloud v1</w:t>
+        <w:t xml:space="preserve">    ├── 12_Manual_Despliegue_Cloud_Produccion    # Manual de Despliegue en Cloud v1</w:t>
+        <w:br/>
+        <w:t xml:space="preserve">    └── 13_Evidencia_Cumplimiento_Requerimientos_Software # Informe formal con capturas de pantalla de todos los RF/RNF</w:t>
       </w:r>
     </w:p>
     <w:p>
@@ -4446,6 +4448,217 @@
           </w:p>
         </w:tc>
       </w:tr>
+      <w:tr>
+        <w:trPr>
+          <w:trHeight w:val="280"/>
+        </w:trPr>
+        <w:tc>
+          <w:tcPr>
+            <w:tcW w:type="dxa" w:w="1560"/>
+            <w:vAlign w:val="center"/>
+            <w:tcMar>
+              <w:top w:w="120" w:type="dxa"/>
+              <w:bottom w:w="120" w:type="dxa"/>
+              <w:left w:w="150" w:type="dxa"/>
+              <w:right w:w="150" w:type="dxa"/>
+            </w:tcMar>
+            <w:shd w:fill="F8FAFC"/>
+          </w:tcPr>
+          <w:p>
+            <w:pPr>
+              <w:spacing w:before="0" w:after="0" w:line="276" w:lineRule="auto"/>
+            </w:pPr>
+            <w:r>
+              <w:rPr>
+                <w:rFonts w:ascii="Calibri" w:hAnsi="Calibri"/>
+                <w:b/>
+                <w:color w:val="1E293B"/>
+                <w:sz w:val="19"/>
+              </w:rPr>
+              <w:t>13</w:t>
+            </w:r>
+          </w:p>
+        </w:tc>
+        <w:tc>
+          <w:tcPr>
+            <w:tcW w:type="dxa" w:w="1560"/>
+            <w:vAlign w:val="center"/>
+            <w:tcMar>
+              <w:top w:w="120" w:type="dxa"/>
+              <w:bottom w:w="120" w:type="dxa"/>
+              <w:left w:w="150" w:type="dxa"/>
+              <w:right w:w="150" w:type="dxa"/>
+            </w:tcMar>
+            <w:shd w:fill="F8FAFC"/>
+          </w:tcPr>
+          <w:p>
+            <w:pPr>
+              <w:spacing w:before="0" w:after="0" w:line="276" w:lineRule="auto"/>
+            </w:pPr>
+            <w:r>
+              <w:rPr>
+                <w:rFonts w:ascii="Calibri" w:hAnsi="Calibri"/>
+                <w:b/>
+                <w:color w:val="1E293B"/>
+                <w:sz w:val="19"/>
+              </w:rPr>
+              <w:t>Evidencia de Requerimientos de Software</w:t>
+            </w:r>
+          </w:p>
+        </w:tc>
+        <w:tc>
+          <w:tcPr>
+            <w:tcW w:type="dxa" w:w="1560"/>
+            <w:vAlign w:val="center"/>
+            <w:tcMar>
+              <w:top w:w="120" w:type="dxa"/>
+              <w:bottom w:w="120" w:type="dxa"/>
+              <w:left w:w="150" w:type="dxa"/>
+              <w:right w:w="150" w:type="dxa"/>
+            </w:tcMar>
+            <w:shd w:fill="F8FAFC"/>
+          </w:tcPr>
+          <w:p>
+            <w:pPr>
+              <w:spacing w:before="0" w:after="0" w:line="276" w:lineRule="auto"/>
+            </w:pPr>
+            <w:r>
+              <w:rPr>
+                <w:rFonts w:ascii="Calibri" w:hAnsi="Calibri"/>
+                <w:color w:val="1E293B"/>
+                <w:sz w:val="19"/>
+              </w:rPr>
+              <w:t>[</w:t>
+            </w:r>
+            <w:r>
+              <w:rPr>
+                <w:rFonts w:ascii="Consolas" w:hAnsi="Consolas"/>
+                <w:color w:val="C2410C"/>
+                <w:sz w:val="19"/>
+              </w:rPr>
+              <w:t>MD</w:t>
+            </w:r>
+            <w:r>
+              <w:rPr>
+                <w:rFonts w:ascii="Calibri" w:hAnsi="Calibri"/>
+                <w:color w:val="1E293B"/>
+                <w:sz w:val="19"/>
+              </w:rPr>
+              <w:t>](13_Evidencia_Cumplimiento_Requerimientos_Software.md)</w:t>
+            </w:r>
+          </w:p>
+        </w:tc>
+        <w:tc>
+          <w:tcPr>
+            <w:tcW w:type="dxa" w:w="1560"/>
+            <w:vAlign w:val="center"/>
+            <w:tcMar>
+              <w:top w:w="120" w:type="dxa"/>
+              <w:bottom w:w="120" w:type="dxa"/>
+              <w:left w:w="150" w:type="dxa"/>
+              <w:right w:w="150" w:type="dxa"/>
+            </w:tcMar>
+            <w:shd w:fill="F8FAFC"/>
+          </w:tcPr>
+          <w:p>
+            <w:pPr>
+              <w:spacing w:before="0" w:after="0" w:line="276" w:lineRule="auto"/>
+            </w:pPr>
+            <w:r>
+              <w:rPr>
+                <w:rFonts w:ascii="Calibri" w:hAnsi="Calibri"/>
+                <w:color w:val="1E293B"/>
+                <w:sz w:val="19"/>
+              </w:rPr>
+              <w:t>[</w:t>
+            </w:r>
+            <w:r>
+              <w:rPr>
+                <w:rFonts w:ascii="Consolas" w:hAnsi="Consolas"/>
+                <w:color w:val="C2410C"/>
+                <w:sz w:val="19"/>
+              </w:rPr>
+              <w:t>DOCX</w:t>
+            </w:r>
+            <w:r>
+              <w:rPr>
+                <w:rFonts w:ascii="Calibri" w:hAnsi="Calibri"/>
+                <w:color w:val="1E293B"/>
+                <w:sz w:val="19"/>
+              </w:rPr>
+              <w:t>](13_Evidencia_Cumplimiento_Requerimientos_Software.docx)</w:t>
+            </w:r>
+          </w:p>
+        </w:tc>
+        <w:tc>
+          <w:tcPr>
+            <w:tcW w:type="dxa" w:w="1560"/>
+            <w:vAlign w:val="center"/>
+            <w:tcMar>
+              <w:top w:w="120" w:type="dxa"/>
+              <w:bottom w:w="120" w:type="dxa"/>
+              <w:left w:w="150" w:type="dxa"/>
+              <w:right w:w="150" w:type="dxa"/>
+            </w:tcMar>
+            <w:shd w:fill="F8FAFC"/>
+          </w:tcPr>
+          <w:p>
+            <w:pPr>
+              <w:spacing w:before="0" w:after="0" w:line="276" w:lineRule="auto"/>
+            </w:pPr>
+            <w:r>
+              <w:rPr>
+                <w:rFonts w:ascii="Calibri" w:hAnsi="Calibri"/>
+                <w:color w:val="1E293B"/>
+                <w:sz w:val="19"/>
+              </w:rPr>
+              <w:t>[</w:t>
+            </w:r>
+            <w:r>
+              <w:rPr>
+                <w:rFonts w:ascii="Consolas" w:hAnsi="Consolas"/>
+                <w:color w:val="C2410C"/>
+                <w:sz w:val="19"/>
+              </w:rPr>
+              <w:t>PDF</w:t>
+            </w:r>
+            <w:r>
+              <w:rPr>
+                <w:rFonts w:ascii="Calibri" w:hAnsi="Calibri"/>
+                <w:color w:val="1E293B"/>
+                <w:sz w:val="19"/>
+              </w:rPr>
+              <w:t>](13_Evidencia_Cumplimiento_Requerimientos_Software.pdf)</w:t>
+            </w:r>
+          </w:p>
+        </w:tc>
+        <w:tc>
+          <w:tcPr>
+            <w:tcW w:type="dxa" w:w="1560"/>
+            <w:vAlign w:val="center"/>
+            <w:tcMar>
+              <w:top w:w="120" w:type="dxa"/>
+              <w:bottom w:w="120" w:type="dxa"/>
+              <w:left w:w="150" w:type="dxa"/>
+              <w:right w:w="150" w:type="dxa"/>
+            </w:tcMar>
+            <w:shd w:fill="F8FAFC"/>
+          </w:tcPr>
+          <w:p>
+            <w:pPr>
+              <w:spacing w:before="0" w:after="0" w:line="276" w:lineRule="auto"/>
+            </w:pPr>
+            <w:r>
+              <w:rPr>
+                <w:rFonts w:ascii="Calibri" w:hAnsi="Calibri"/>
+                <w:color w:val="1E293B"/>
+                <w:sz w:val="19"/>
+              </w:rPr>
+              <w:t>Informe formal de validación con 15 capturas de pantalla de alta fidelidad de todos los RF-001/018 y RNF-001/010.</w:t>
+            </w:r>
+          </w:p>
+        </w:tc>
+      </w:tr>
     </w:tbl>
     <w:p>
       <w:pPr>

</xml_diff>

<commit_message>
docs(master): consolidar fuente unica de verdad en DOCUMENTO_MAESTRO_INTEGRAL_LEOFIT (70 pags, 13 caps, 26 figuras)
</commit_message>
<xml_diff>
--- a/docs/README.docx
+++ b/docs/README.docx
@@ -126,7 +126,17 @@
         </w:rPr>
         <w:t>docs/</w:t>
         <w:br/>
-        <w:t>├── Entregables Oficiales Consolidados:</w:t>
+        <w:t>├── FUENTE ÚNICA DE VERDAD (DOCUMENTO MAESTRO TOTAL):</w:t>
+        <w:br/>
+        <w:t>│   ├── DOCUMENTO_MAESTRO_INTEGRAL_LEOFIT.pdf   # Libro Maestro Integral (70 págs, 13 Capítulos, Diagramas y 14 Pantallas)</w:t>
+        <w:br/>
+        <w:t>│   ├── DOCUMENTO_MAESTRO_INTEGRAL_LEOFIT.docx  # Documento Maestro Editable en Microsoft Word</w:t>
+        <w:br/>
+        <w:t>│   └── DOCUMENTO_MAESTRO_INTEGRAL_LEOFIT.md    # Versión Markdown completa y trazable</w:t>
+        <w:br/>
+        <w:t>│</w:t>
+        <w:br/>
+        <w:t>├── Entregables Oficiales por Hito de Evaluación:</w:t>
         <w:br/>
         <w:t>│   ├── INFORME_FINAL_APF2_LEOFIT.pdf       # Entregable Oficial Maestro APF2 (PDF)</w:t>
         <w:br/>
@@ -172,7 +182,7 @@
         <w:br/>
         <w:t>│</w:t>
         <w:br/>
-        <w:t>└── Módulos Temáticos de Ingeniería (Formatos MD / DOCX / PDF):</w:t>
+        <w:t>└── Anexos Especializados de Ingeniería (Formatos MD / DOCX / PDF):</w:t>
         <w:br/>
         <w:t xml:space="preserve">    ├── 01_Ficha_Identificacion         # Ficha institucional de identificación del proyecto</w:t>
         <w:br/>
@@ -203,48 +213,6 @@
     </w:p>
     <w:p>
       <w:pPr>
-        <w:spacing w:before="40" w:after="80" w:line="276" w:lineRule="auto"/>
-      </w:pPr>
-      <w:r>
-        <w:rPr>
-          <w:rFonts w:ascii="Calibri" w:hAnsi="Calibri"/>
-          <w:color w:val="1E293B"/>
-          <w:sz w:val="22"/>
-        </w:rPr>
-        <w:t>&gt; [!NOTE]</w:t>
-      </w:r>
-    </w:p>
-    <w:p>
-      <w:pPr>
-        <w:spacing w:before="40" w:after="80" w:line="276" w:lineRule="auto"/>
-      </w:pPr>
-      <w:r>
-        <w:rPr>
-          <w:rFonts w:ascii="Calibri" w:hAnsi="Calibri"/>
-          <w:color w:val="1E293B"/>
-          <w:sz w:val="22"/>
-        </w:rPr>
-        <w:t>&gt; Para la entrega institucional en la plataforma académica, el archivo maestro consolidado de APF2 también se replica en [</w:t>
-      </w:r>
-      <w:r>
-        <w:rPr>
-          <w:rFonts w:ascii="Consolas" w:hAnsi="Consolas"/>
-          <w:color w:val="C2410C"/>
-          <w:sz w:val="19"/>
-        </w:rPr>
-        <w:t>Integrator/informe/DOCUMENTACION.docx</w:t>
-      </w:r>
-      <w:r>
-        <w:rPr>
-          <w:rFonts w:ascii="Calibri" w:hAnsi="Calibri"/>
-          <w:color w:val="1E293B"/>
-          <w:sz w:val="22"/>
-        </w:rPr>
-        <w:t>](../Integrator/informe/DOCUMENTACION.docx) conforme a la estructura requerida por el estándar de entrega de Curso Integrador II.</w:t>
-      </w:r>
-    </w:p>
-    <w:p>
-      <w:pPr>
         <w:keepNext/>
         <w:spacing w:before="280" w:after="80"/>
       </w:pPr>
@@ -255,7 +223,7 @@
           <w:color w:val="F97316"/>
           <w:sz w:val="28"/>
         </w:rPr>
-        <w:t>1. Entregables Oficiales Consolidados por Hito</w:t>
+        <w:t>1. Documento Maestro y Entregables Consolidados</w:t>
       </w:r>
     </w:p>
     <w:tbl>
@@ -265,11 +233,12 @@
         <w:tblLook w:firstColumn="1" w:firstRow="1" w:lastColumn="0" w:lastRow="0" w:noHBand="0" w:noVBand="1" w:val="04A0"/>
       </w:tblPr>
       <w:tblGrid>
-        <w:gridCol w:w="1872"/>
-        <w:gridCol w:w="1872"/>
-        <w:gridCol w:w="1872"/>
-        <w:gridCol w:w="1872"/>
-        <w:gridCol w:w="1872"/>
+        <w:gridCol w:w="1560"/>
+        <w:gridCol w:w="1560"/>
+        <w:gridCol w:w="1560"/>
+        <w:gridCol w:w="1560"/>
+        <w:gridCol w:w="1560"/>
+        <w:gridCol w:w="1560"/>
       </w:tblGrid>
       <w:tr>
         <w:trPr>
@@ -277,7 +246,7 @@
         </w:trPr>
         <w:tc>
           <w:tcPr>
-            <w:tcW w:type="dxa" w:w="1872"/>
+            <w:tcW w:type="dxa" w:w="1560"/>
             <w:vAlign w:val="center"/>
             <w:tcMar>
               <w:top w:w="120" w:type="dxa"/>
@@ -298,13 +267,13 @@
                 <w:color w:val="FFFFFF"/>
                 <w:sz w:val="20"/>
               </w:rPr>
-              <w:t>Hito Académico</w:t>
+              <w:t>Documento / Hito</w:t>
             </w:r>
           </w:p>
         </w:tc>
         <w:tc>
           <w:tcPr>
-            <w:tcW w:type="dxa" w:w="1872"/>
+            <w:tcW w:type="dxa" w:w="1560"/>
             <w:vAlign w:val="center"/>
             <w:tcMar>
               <w:top w:w="120" w:type="dxa"/>
@@ -331,7 +300,7 @@
         </w:tc>
         <w:tc>
           <w:tcPr>
-            <w:tcW w:type="dxa" w:w="1872"/>
+            <w:tcW w:type="dxa" w:w="1560"/>
             <w:vAlign w:val="center"/>
             <w:tcMar>
               <w:top w:w="120" w:type="dxa"/>
@@ -352,13 +321,13 @@
                 <w:color w:val="FFFFFF"/>
                 <w:sz w:val="20"/>
               </w:rPr>
-              <w:t>Estado / Calificación</w:t>
+              <w:t>Estado</w:t>
             </w:r>
           </w:p>
         </w:tc>
         <w:tc>
           <w:tcPr>
-            <w:tcW w:type="dxa" w:w="1872"/>
+            <w:tcW w:type="dxa" w:w="1560"/>
             <w:vAlign w:val="center"/>
             <w:tcMar>
               <w:top w:w="120" w:type="dxa"/>
@@ -385,7 +354,7 @@
         </w:tc>
         <w:tc>
           <w:tcPr>
-            <w:tcW w:type="dxa" w:w="1872"/>
+            <w:tcW w:type="dxa" w:w="1560"/>
             <w:vAlign w:val="center"/>
             <w:tcMar>
               <w:top w:w="120" w:type="dxa"/>
@@ -410,6 +379,33 @@
             </w:r>
           </w:p>
         </w:tc>
+        <w:tc>
+          <w:tcPr>
+            <w:tcW w:type="dxa" w:w="1560"/>
+            <w:vAlign w:val="center"/>
+            <w:tcMar>
+              <w:top w:w="120" w:type="dxa"/>
+              <w:bottom w:w="120" w:type="dxa"/>
+              <w:left w:w="150" w:type="dxa"/>
+              <w:right w:w="150" w:type="dxa"/>
+            </w:tcMar>
+            <w:shd w:fill="0F172A"/>
+          </w:tcPr>
+          <w:p>
+            <w:pPr>
+              <w:spacing w:before="0" w:after="0" w:line="276" w:lineRule="auto"/>
+            </w:pPr>
+            <w:r>
+              <w:rPr>
+                <w:rFonts w:ascii="Calibri" w:hAnsi="Calibri"/>
+                <w:b/>
+                <w:color w:val="FFFFFF"/>
+                <w:sz w:val="20"/>
+              </w:rPr>
+              <w:t>Formato MD</w:t>
+            </w:r>
+          </w:p>
+        </w:tc>
       </w:tr>
       <w:tr>
         <w:trPr>
@@ -417,7 +413,7 @@
         </w:trPr>
         <w:tc>
           <w:tcPr>
-            <w:tcW w:type="dxa" w:w="1872"/>
+            <w:tcW w:type="dxa" w:w="1560"/>
             <w:vAlign w:val="center"/>
             <w:tcMar>
               <w:top w:w="120" w:type="dxa"/>
@@ -438,39 +434,13 @@
                 <w:color w:val="1E293B"/>
                 <w:sz w:val="19"/>
               </w:rPr>
-              <w:t>APF1 (Avance 1)</w:t>
+              <w:t>DOCUMENTO MAESTRO INTEGRAL (SSOT)</w:t>
             </w:r>
           </w:p>
         </w:tc>
         <w:tc>
           <w:tcPr>
-            <w:tcW w:type="dxa" w:w="1872"/>
-            <w:vAlign w:val="center"/>
-            <w:tcMar>
-              <w:top w:w="120" w:type="dxa"/>
-              <w:bottom w:w="120" w:type="dxa"/>
-              <w:left w:w="150" w:type="dxa"/>
-              <w:right w:w="150" w:type="dxa"/>
-            </w:tcMar>
-            <w:shd w:fill="F8FAFC"/>
-          </w:tcPr>
-          <w:p>
-            <w:pPr>
-              <w:spacing w:before="0" w:after="0" w:line="276" w:lineRule="auto"/>
-            </w:pPr>
-            <w:r>
-              <w:rPr>
-                <w:rFonts w:ascii="Calibri" w:hAnsi="Calibri"/>
-                <w:color w:val="1E293B"/>
-                <w:sz w:val="19"/>
-              </w:rPr>
-              <w:t>Semana 05</w:t>
-            </w:r>
-          </w:p>
-        </w:tc>
-        <w:tc>
-          <w:tcPr>
-            <w:tcW w:type="dxa" w:w="1872"/>
+            <w:tcW w:type="dxa" w:w="1560"/>
             <w:vAlign w:val="center"/>
             <w:tcMar>
               <w:top w:w="120" w:type="dxa"/>
@@ -491,266 +461,13 @@
                 <w:color w:val="1E293B"/>
                 <w:sz w:val="19"/>
               </w:rPr>
-              <w:t>Aprobado (18/20)</w:t>
+              <w:t>Consolidado</w:t>
             </w:r>
           </w:p>
         </w:tc>
         <w:tc>
           <w:tcPr>
-            <w:tcW w:type="dxa" w:w="1872"/>
-            <w:vAlign w:val="center"/>
-            <w:tcMar>
-              <w:top w:w="120" w:type="dxa"/>
-              <w:bottom w:w="120" w:type="dxa"/>
-              <w:left w:w="150" w:type="dxa"/>
-              <w:right w:w="150" w:type="dxa"/>
-            </w:tcMar>
-            <w:shd w:fill="F8FAFC"/>
-          </w:tcPr>
-          <w:p>
-            <w:pPr>
-              <w:spacing w:before="0" w:after="0" w:line="276" w:lineRule="auto"/>
-            </w:pPr>
-            <w:r>
-              <w:rPr>
-                <w:rFonts w:ascii="Calibri" w:hAnsi="Calibri"/>
-                <w:color w:val="1E293B"/>
-                <w:sz w:val="19"/>
-              </w:rPr>
-              <w:t>[</w:t>
-            </w:r>
-            <w:r>
-              <w:rPr>
-                <w:rFonts w:ascii="Consolas" w:hAnsi="Consolas"/>
-                <w:color w:val="C2410C"/>
-                <w:sz w:val="19"/>
-              </w:rPr>
-              <w:t>INFORME_FINAL_APF1_LEOFIT.docx</w:t>
-            </w:r>
-            <w:r>
-              <w:rPr>
-                <w:rFonts w:ascii="Calibri" w:hAnsi="Calibri"/>
-                <w:color w:val="1E293B"/>
-                <w:sz w:val="19"/>
-              </w:rPr>
-              <w:t>](INFORME_FINAL_APF1_LEOFIT.docx)</w:t>
-            </w:r>
-          </w:p>
-        </w:tc>
-        <w:tc>
-          <w:tcPr>
-            <w:tcW w:type="dxa" w:w="1872"/>
-            <w:vAlign w:val="center"/>
-            <w:tcMar>
-              <w:top w:w="120" w:type="dxa"/>
-              <w:bottom w:w="120" w:type="dxa"/>
-              <w:left w:w="150" w:type="dxa"/>
-              <w:right w:w="150" w:type="dxa"/>
-            </w:tcMar>
-            <w:shd w:fill="F8FAFC"/>
-          </w:tcPr>
-          <w:p>
-            <w:pPr>
-              <w:spacing w:before="0" w:after="0" w:line="276" w:lineRule="auto"/>
-            </w:pPr>
-            <w:r>
-              <w:rPr>
-                <w:rFonts w:ascii="Calibri" w:hAnsi="Calibri"/>
-                <w:color w:val="1E293B"/>
-                <w:sz w:val="19"/>
-              </w:rPr>
-              <w:t>[</w:t>
-            </w:r>
-            <w:r>
-              <w:rPr>
-                <w:rFonts w:ascii="Consolas" w:hAnsi="Consolas"/>
-                <w:color w:val="C2410C"/>
-                <w:sz w:val="19"/>
-              </w:rPr>
-              <w:t>INFORME_FINAL_APF1_LEOFIT.pdf</w:t>
-            </w:r>
-            <w:r>
-              <w:rPr>
-                <w:rFonts w:ascii="Calibri" w:hAnsi="Calibri"/>
-                <w:color w:val="1E293B"/>
-                <w:sz w:val="19"/>
-              </w:rPr>
-              <w:t>](INFORME_FINAL_APF1_LEOFIT.pdf)</w:t>
-            </w:r>
-          </w:p>
-        </w:tc>
-      </w:tr>
-      <w:tr>
-        <w:trPr>
-          <w:trHeight w:val="280"/>
-        </w:trPr>
-        <w:tc>
-          <w:tcPr>
-            <w:tcW w:type="dxa" w:w="1872"/>
-            <w:vAlign w:val="center"/>
-            <w:tcMar>
-              <w:top w:w="120" w:type="dxa"/>
-              <w:bottom w:w="120" w:type="dxa"/>
-              <w:left w:w="150" w:type="dxa"/>
-              <w:right w:w="150" w:type="dxa"/>
-            </w:tcMar>
-          </w:tcPr>
-          <w:p>
-            <w:pPr>
-              <w:spacing w:before="0" w:after="0" w:line="276" w:lineRule="auto"/>
-            </w:pPr>
-            <w:r>
-              <w:rPr>
-                <w:rFonts w:ascii="Calibri" w:hAnsi="Calibri"/>
-                <w:b/>
-                <w:color w:val="1E293B"/>
-                <w:sz w:val="19"/>
-              </w:rPr>
-              <w:t>APF2 (Avance 2)</w:t>
-            </w:r>
-          </w:p>
-        </w:tc>
-        <w:tc>
-          <w:tcPr>
-            <w:tcW w:type="dxa" w:w="1872"/>
-            <w:vAlign w:val="center"/>
-            <w:tcMar>
-              <w:top w:w="120" w:type="dxa"/>
-              <w:bottom w:w="120" w:type="dxa"/>
-              <w:left w:w="150" w:type="dxa"/>
-              <w:right w:w="150" w:type="dxa"/>
-            </w:tcMar>
-          </w:tcPr>
-          <w:p>
-            <w:pPr>
-              <w:spacing w:before="0" w:after="0" w:line="276" w:lineRule="auto"/>
-            </w:pPr>
-            <w:r>
-              <w:rPr>
-                <w:rFonts w:ascii="Calibri" w:hAnsi="Calibri"/>
-                <w:color w:val="1E293B"/>
-                <w:sz w:val="19"/>
-              </w:rPr>
-              <w:t>Semana 09</w:t>
-            </w:r>
-          </w:p>
-        </w:tc>
-        <w:tc>
-          <w:tcPr>
-            <w:tcW w:type="dxa" w:w="1872"/>
-            <w:vAlign w:val="center"/>
-            <w:tcMar>
-              <w:top w:w="120" w:type="dxa"/>
-              <w:bottom w:w="120" w:type="dxa"/>
-              <w:left w:w="150" w:type="dxa"/>
-              <w:right w:w="150" w:type="dxa"/>
-            </w:tcMar>
-          </w:tcPr>
-          <w:p>
-            <w:pPr>
-              <w:spacing w:before="0" w:after="0" w:line="276" w:lineRule="auto"/>
-            </w:pPr>
-            <w:r>
-              <w:rPr>
-                <w:rFonts w:ascii="Calibri" w:hAnsi="Calibri"/>
-                <w:b/>
-                <w:color w:val="1E293B"/>
-                <w:sz w:val="19"/>
-              </w:rPr>
-              <w:t>100% Completado</w:t>
-            </w:r>
-          </w:p>
-        </w:tc>
-        <w:tc>
-          <w:tcPr>
-            <w:tcW w:type="dxa" w:w="1872"/>
-            <w:vAlign w:val="center"/>
-            <w:tcMar>
-              <w:top w:w="120" w:type="dxa"/>
-              <w:bottom w:w="120" w:type="dxa"/>
-              <w:left w:w="150" w:type="dxa"/>
-              <w:right w:w="150" w:type="dxa"/>
-            </w:tcMar>
-          </w:tcPr>
-          <w:p>
-            <w:pPr>
-              <w:spacing w:before="0" w:after="0" w:line="276" w:lineRule="auto"/>
-            </w:pPr>
-            <w:r>
-              <w:rPr>
-                <w:rFonts w:ascii="Calibri" w:hAnsi="Calibri"/>
-                <w:color w:val="1E293B"/>
-                <w:sz w:val="19"/>
-              </w:rPr>
-              <w:t>[</w:t>
-            </w:r>
-            <w:r>
-              <w:rPr>
-                <w:rFonts w:ascii="Consolas" w:hAnsi="Consolas"/>
-                <w:color w:val="C2410C"/>
-                <w:sz w:val="19"/>
-              </w:rPr>
-              <w:t>INFORME_FINAL_APF2_LEOFIT.docx</w:t>
-            </w:r>
-            <w:r>
-              <w:rPr>
-                <w:rFonts w:ascii="Calibri" w:hAnsi="Calibri"/>
-                <w:color w:val="1E293B"/>
-                <w:sz w:val="19"/>
-              </w:rPr>
-              <w:t>](INFORME_FINAL_APF2_LEOFIT.docx)</w:t>
-            </w:r>
-          </w:p>
-        </w:tc>
-        <w:tc>
-          <w:tcPr>
-            <w:tcW w:type="dxa" w:w="1872"/>
-            <w:vAlign w:val="center"/>
-            <w:tcMar>
-              <w:top w:w="120" w:type="dxa"/>
-              <w:bottom w:w="120" w:type="dxa"/>
-              <w:left w:w="150" w:type="dxa"/>
-              <w:right w:w="150" w:type="dxa"/>
-            </w:tcMar>
-          </w:tcPr>
-          <w:p>
-            <w:pPr>
-              <w:spacing w:before="0" w:after="0" w:line="276" w:lineRule="auto"/>
-            </w:pPr>
-            <w:r>
-              <w:rPr>
-                <w:rFonts w:ascii="Calibri" w:hAnsi="Calibri"/>
-                <w:color w:val="1E293B"/>
-                <w:sz w:val="19"/>
-              </w:rPr>
-              <w:t>[</w:t>
-            </w:r>
-            <w:r>
-              <w:rPr>
-                <w:rFonts w:ascii="Consolas" w:hAnsi="Consolas"/>
-                <w:color w:val="C2410C"/>
-                <w:sz w:val="19"/>
-              </w:rPr>
-              <w:t>INFORME_FINAL_APF2_LEOFIT.pdf</w:t>
-            </w:r>
-            <w:r>
-              <w:rPr>
-                <w:rFonts w:ascii="Calibri" w:hAnsi="Calibri"/>
-                <w:color w:val="1E293B"/>
-                <w:sz w:val="19"/>
-              </w:rPr>
-              <w:t>](INFORME_FINAL_APF2_LEOFIT.pdf)</w:t>
-            </w:r>
-          </w:p>
-        </w:tc>
-      </w:tr>
-      <w:tr>
-        <w:trPr>
-          <w:trHeight w:val="280"/>
-        </w:trPr>
-        <w:tc>
-          <w:tcPr>
-            <w:tcW w:type="dxa" w:w="1872"/>
+            <w:tcW w:type="dxa" w:w="1560"/>
             <w:vAlign w:val="center"/>
             <w:tcMar>
               <w:top w:w="120" w:type="dxa"/>
@@ -771,13 +488,13 @@
                 <w:color w:val="1E293B"/>
                 <w:sz w:val="19"/>
               </w:rPr>
-              <w:t>APF3 (Avance 3)</w:t>
+              <w:t>Aprobado (Definitivo)</w:t>
             </w:r>
           </w:p>
         </w:tc>
         <w:tc>
           <w:tcPr>
-            <w:tcW w:type="dxa" w:w="1872"/>
+            <w:tcW w:type="dxa" w:w="1560"/>
             <w:vAlign w:val="center"/>
             <w:tcMar>
               <w:top w:w="120" w:type="dxa"/>
@@ -797,13 +514,13 @@
                 <w:color w:val="1E293B"/>
                 <w:sz w:val="19"/>
               </w:rPr>
-              <w:t>Semana 13</w:t>
+              <w:t>[Descargar .docx](./DOCUMENTO_MAESTRO_INTEGRAL_LEOFIT.docx)</w:t>
             </w:r>
           </w:p>
         </w:tc>
         <w:tc>
           <w:tcPr>
-            <w:tcW w:type="dxa" w:w="1872"/>
+            <w:tcW w:type="dxa" w:w="1560"/>
             <w:vAlign w:val="center"/>
             <w:tcMar>
               <w:top w:w="120" w:type="dxa"/>
@@ -823,13 +540,616 @@
                 <w:color w:val="1E293B"/>
                 <w:sz w:val="19"/>
               </w:rPr>
+              <w:t>[Descargar .pdf](./DOCUMENTO_MAESTRO_INTEGRAL_LEOFIT.pdf)</w:t>
+            </w:r>
+          </w:p>
+        </w:tc>
+        <w:tc>
+          <w:tcPr>
+            <w:tcW w:type="dxa" w:w="1560"/>
+            <w:vAlign w:val="center"/>
+            <w:tcMar>
+              <w:top w:w="120" w:type="dxa"/>
+              <w:bottom w:w="120" w:type="dxa"/>
+              <w:left w:w="150" w:type="dxa"/>
+              <w:right w:w="150" w:type="dxa"/>
+            </w:tcMar>
+            <w:shd w:fill="F8FAFC"/>
+          </w:tcPr>
+          <w:p>
+            <w:pPr>
+              <w:spacing w:before="0" w:after="0" w:line="276" w:lineRule="auto"/>
+            </w:pPr>
+            <w:r>
+              <w:rPr>
+                <w:rFonts w:ascii="Calibri" w:hAnsi="Calibri"/>
+                <w:color w:val="1E293B"/>
+                <w:sz w:val="19"/>
+              </w:rPr>
+              <w:t>[Ver .md](./DOCUMENTO_MAESTRO_INTEGRAL_LEOFIT.md)</w:t>
+            </w:r>
+          </w:p>
+        </w:tc>
+      </w:tr>
+      <w:tr>
+        <w:trPr>
+          <w:trHeight w:val="280"/>
+        </w:trPr>
+        <w:tc>
+          <w:tcPr>
+            <w:tcW w:type="dxa" w:w="1560"/>
+            <w:vAlign w:val="center"/>
+            <w:tcMar>
+              <w:top w:w="120" w:type="dxa"/>
+              <w:bottom w:w="120" w:type="dxa"/>
+              <w:left w:w="150" w:type="dxa"/>
+              <w:right w:w="150" w:type="dxa"/>
+            </w:tcMar>
+          </w:tcPr>
+          <w:p>
+            <w:pPr>
+              <w:spacing w:before="0" w:after="0" w:line="276" w:lineRule="auto"/>
+            </w:pPr>
+            <w:r>
+              <w:rPr>
+                <w:rFonts w:ascii="Calibri" w:hAnsi="Calibri"/>
+                <w:b/>
+                <w:color w:val="1E293B"/>
+                <w:sz w:val="19"/>
+              </w:rPr>
+              <w:t>Avance de Proyecto Final 2 (APF2)</w:t>
+            </w:r>
+          </w:p>
+        </w:tc>
+        <w:tc>
+          <w:tcPr>
+            <w:tcW w:type="dxa" w:w="1560"/>
+            <w:vAlign w:val="center"/>
+            <w:tcMar>
+              <w:top w:w="120" w:type="dxa"/>
+              <w:bottom w:w="120" w:type="dxa"/>
+              <w:left w:w="150" w:type="dxa"/>
+              <w:right w:w="150" w:type="dxa"/>
+            </w:tcMar>
+          </w:tcPr>
+          <w:p>
+            <w:pPr>
+              <w:spacing w:before="0" w:after="0" w:line="276" w:lineRule="auto"/>
+            </w:pPr>
+            <w:r>
+              <w:rPr>
+                <w:rFonts w:ascii="Calibri" w:hAnsi="Calibri"/>
+                <w:color w:val="1E293B"/>
+                <w:sz w:val="19"/>
+              </w:rPr>
+              <w:t>S12</w:t>
+            </w:r>
+          </w:p>
+        </w:tc>
+        <w:tc>
+          <w:tcPr>
+            <w:tcW w:type="dxa" w:w="1560"/>
+            <w:vAlign w:val="center"/>
+            <w:tcMar>
+              <w:top w:w="120" w:type="dxa"/>
+              <w:bottom w:w="120" w:type="dxa"/>
+              <w:left w:w="150" w:type="dxa"/>
+              <w:right w:w="150" w:type="dxa"/>
+            </w:tcMar>
+          </w:tcPr>
+          <w:p>
+            <w:pPr>
+              <w:spacing w:before="0" w:after="0" w:line="276" w:lineRule="auto"/>
+            </w:pPr>
+            <w:r>
+              <w:rPr>
+                <w:rFonts w:ascii="Calibri" w:hAnsi="Calibri"/>
+                <w:color w:val="1E293B"/>
+                <w:sz w:val="19"/>
+              </w:rPr>
+              <w:t>Entregado / Calificado</w:t>
+            </w:r>
+          </w:p>
+        </w:tc>
+        <w:tc>
+          <w:tcPr>
+            <w:tcW w:type="dxa" w:w="1560"/>
+            <w:vAlign w:val="center"/>
+            <w:tcMar>
+              <w:top w:w="120" w:type="dxa"/>
+              <w:bottom w:w="120" w:type="dxa"/>
+              <w:left w:w="150" w:type="dxa"/>
+              <w:right w:w="150" w:type="dxa"/>
+            </w:tcMar>
+          </w:tcPr>
+          <w:p>
+            <w:pPr>
+              <w:spacing w:before="0" w:after="0" w:line="276" w:lineRule="auto"/>
+            </w:pPr>
+            <w:r>
+              <w:rPr>
+                <w:rFonts w:ascii="Calibri" w:hAnsi="Calibri"/>
+                <w:color w:val="1E293B"/>
+                <w:sz w:val="19"/>
+              </w:rPr>
+              <w:t>[Descargar .docx](./INFORME_FINAL_APF2_LEOFIT.docx)</w:t>
+            </w:r>
+          </w:p>
+        </w:tc>
+        <w:tc>
+          <w:tcPr>
+            <w:tcW w:type="dxa" w:w="1560"/>
+            <w:vAlign w:val="center"/>
+            <w:tcMar>
+              <w:top w:w="120" w:type="dxa"/>
+              <w:bottom w:w="120" w:type="dxa"/>
+              <w:left w:w="150" w:type="dxa"/>
+              <w:right w:w="150" w:type="dxa"/>
+            </w:tcMar>
+          </w:tcPr>
+          <w:p>
+            <w:pPr>
+              <w:spacing w:before="0" w:after="0" w:line="276" w:lineRule="auto"/>
+            </w:pPr>
+            <w:r>
+              <w:rPr>
+                <w:rFonts w:ascii="Calibri" w:hAnsi="Calibri"/>
+                <w:color w:val="1E293B"/>
+                <w:sz w:val="19"/>
+              </w:rPr>
+              <w:t>[Descargar .pdf](./INFORME_FINAL_APF2_LEOFIT.pdf)</w:t>
+            </w:r>
+          </w:p>
+        </w:tc>
+        <w:tc>
+          <w:tcPr>
+            <w:tcW w:type="dxa" w:w="1560"/>
+            <w:vAlign w:val="center"/>
+            <w:tcMar>
+              <w:top w:w="120" w:type="dxa"/>
+              <w:bottom w:w="120" w:type="dxa"/>
+              <w:left w:w="150" w:type="dxa"/>
+              <w:right w:w="150" w:type="dxa"/>
+            </w:tcMar>
+          </w:tcPr>
+          <w:p>
+            <w:pPr>
+              <w:spacing w:before="0" w:after="0" w:line="276" w:lineRule="auto"/>
+            </w:pPr>
+            <w:r>
+              <w:rPr>
+                <w:rFonts w:ascii="Calibri" w:hAnsi="Calibri"/>
+                <w:color w:val="1E293B"/>
+                <w:sz w:val="19"/>
+              </w:rPr>
+              <w:t>—</w:t>
+            </w:r>
+          </w:p>
+        </w:tc>
+      </w:tr>
+      <w:tr>
+        <w:trPr>
+          <w:trHeight w:val="280"/>
+        </w:trPr>
+        <w:tc>
+          <w:tcPr>
+            <w:tcW w:type="dxa" w:w="1560"/>
+            <w:vAlign w:val="center"/>
+            <w:tcMar>
+              <w:top w:w="120" w:type="dxa"/>
+              <w:bottom w:w="120" w:type="dxa"/>
+              <w:left w:w="150" w:type="dxa"/>
+              <w:right w:w="150" w:type="dxa"/>
+            </w:tcMar>
+            <w:shd w:fill="F8FAFC"/>
+          </w:tcPr>
+          <w:p>
+            <w:pPr>
+              <w:spacing w:before="0" w:after="0" w:line="276" w:lineRule="auto"/>
+            </w:pPr>
+            <w:r>
+              <w:rPr>
+                <w:rFonts w:ascii="Calibri" w:hAnsi="Calibri"/>
+                <w:b/>
+                <w:color w:val="1E293B"/>
+                <w:sz w:val="19"/>
+              </w:rPr>
+              <w:t>Avance de Proyecto Final 1 (APF1)</w:t>
+            </w:r>
+          </w:p>
+        </w:tc>
+        <w:tc>
+          <w:tcPr>
+            <w:tcW w:type="dxa" w:w="1560"/>
+            <w:vAlign w:val="center"/>
+            <w:tcMar>
+              <w:top w:w="120" w:type="dxa"/>
+              <w:bottom w:w="120" w:type="dxa"/>
+              <w:left w:w="150" w:type="dxa"/>
+              <w:right w:w="150" w:type="dxa"/>
+            </w:tcMar>
+            <w:shd w:fill="F8FAFC"/>
+          </w:tcPr>
+          <w:p>
+            <w:pPr>
+              <w:spacing w:before="0" w:after="0" w:line="276" w:lineRule="auto"/>
+            </w:pPr>
+            <w:r>
+              <w:rPr>
+                <w:rFonts w:ascii="Calibri" w:hAnsi="Calibri"/>
+                <w:color w:val="1E293B"/>
+                <w:sz w:val="19"/>
+              </w:rPr>
+              <w:t>S07</w:t>
+            </w:r>
+          </w:p>
+        </w:tc>
+        <w:tc>
+          <w:tcPr>
+            <w:tcW w:type="dxa" w:w="1560"/>
+            <w:vAlign w:val="center"/>
+            <w:tcMar>
+              <w:top w:w="120" w:type="dxa"/>
+              <w:bottom w:w="120" w:type="dxa"/>
+              <w:left w:w="150" w:type="dxa"/>
+              <w:right w:w="150" w:type="dxa"/>
+            </w:tcMar>
+            <w:shd w:fill="F8FAFC"/>
+          </w:tcPr>
+          <w:p>
+            <w:pPr>
+              <w:spacing w:before="0" w:after="0" w:line="276" w:lineRule="auto"/>
+            </w:pPr>
+            <w:r>
+              <w:rPr>
+                <w:rFonts w:ascii="Calibri" w:hAnsi="Calibri"/>
+                <w:color w:val="1E293B"/>
+                <w:sz w:val="19"/>
+              </w:rPr>
+              <w:t>Aprobado (</w:t>
+            </w:r>
+            <w:r>
+              <w:rPr>
+                <w:rFonts w:ascii="Calibri" w:hAnsi="Calibri"/>
+                <w:b/>
+                <w:color w:val="1E293B"/>
+                <w:sz w:val="19"/>
+              </w:rPr>
+              <w:t>18/20</w:t>
+            </w:r>
+            <w:r>
+              <w:rPr>
+                <w:rFonts w:ascii="Calibri" w:hAnsi="Calibri"/>
+                <w:color w:val="1E293B"/>
+                <w:sz w:val="19"/>
+              </w:rPr>
+              <w:t>)</w:t>
+            </w:r>
+          </w:p>
+        </w:tc>
+        <w:tc>
+          <w:tcPr>
+            <w:tcW w:type="dxa" w:w="1560"/>
+            <w:vAlign w:val="center"/>
+            <w:tcMar>
+              <w:top w:w="120" w:type="dxa"/>
+              <w:bottom w:w="120" w:type="dxa"/>
+              <w:left w:w="150" w:type="dxa"/>
+              <w:right w:w="150" w:type="dxa"/>
+            </w:tcMar>
+            <w:shd w:fill="F8FAFC"/>
+          </w:tcPr>
+          <w:p>
+            <w:pPr>
+              <w:spacing w:before="0" w:after="0" w:line="276" w:lineRule="auto"/>
+            </w:pPr>
+            <w:r>
+              <w:rPr>
+                <w:rFonts w:ascii="Calibri" w:hAnsi="Calibri"/>
+                <w:color w:val="1E293B"/>
+                <w:sz w:val="19"/>
+              </w:rPr>
+              <w:t>[Descargar .docx](./INFORME_FINAL_APF1_LEOFIT.docx)</w:t>
+            </w:r>
+          </w:p>
+        </w:tc>
+        <w:tc>
+          <w:tcPr>
+            <w:tcW w:type="dxa" w:w="1560"/>
+            <w:vAlign w:val="center"/>
+            <w:tcMar>
+              <w:top w:w="120" w:type="dxa"/>
+              <w:bottom w:w="120" w:type="dxa"/>
+              <w:left w:w="150" w:type="dxa"/>
+              <w:right w:w="150" w:type="dxa"/>
+            </w:tcMar>
+            <w:shd w:fill="F8FAFC"/>
+          </w:tcPr>
+          <w:p>
+            <w:pPr>
+              <w:spacing w:before="0" w:after="0" w:line="276" w:lineRule="auto"/>
+            </w:pPr>
+            <w:r>
+              <w:rPr>
+                <w:rFonts w:ascii="Calibri" w:hAnsi="Calibri"/>
+                <w:color w:val="1E293B"/>
+                <w:sz w:val="19"/>
+              </w:rPr>
+              <w:t>[Descargar .pdf](./INFORME_FINAL_APF1_LEOFIT.pdf)</w:t>
+            </w:r>
+          </w:p>
+        </w:tc>
+        <w:tc>
+          <w:tcPr>
+            <w:tcW w:type="dxa" w:w="1560"/>
+            <w:vAlign w:val="center"/>
+            <w:tcMar>
+              <w:top w:w="120" w:type="dxa"/>
+              <w:bottom w:w="120" w:type="dxa"/>
+              <w:left w:w="150" w:type="dxa"/>
+              <w:right w:w="150" w:type="dxa"/>
+            </w:tcMar>
+            <w:shd w:fill="F8FAFC"/>
+          </w:tcPr>
+          <w:p>
+            <w:pPr>
+              <w:spacing w:before="0" w:after="0" w:line="276" w:lineRule="auto"/>
+            </w:pPr>
+            <w:r>
+              <w:rPr>
+                <w:rFonts w:ascii="Calibri" w:hAnsi="Calibri"/>
+                <w:color w:val="1E293B"/>
+                <w:sz w:val="19"/>
+              </w:rPr>
+              <w:t>[Ver .md](./INFORME_FINAL_APF1_LEOFIT.md)</w:t>
+            </w:r>
+          </w:p>
+        </w:tc>
+      </w:tr>
+      <w:tr>
+        <w:trPr>
+          <w:trHeight w:val="280"/>
+        </w:trPr>
+        <w:tc>
+          <w:tcPr>
+            <w:tcW w:type="dxa" w:w="1560"/>
+            <w:vAlign w:val="center"/>
+            <w:tcMar>
+              <w:top w:w="120" w:type="dxa"/>
+              <w:bottom w:w="120" w:type="dxa"/>
+              <w:left w:w="150" w:type="dxa"/>
+              <w:right w:w="150" w:type="dxa"/>
+            </w:tcMar>
+          </w:tcPr>
+          <w:p>
+            <w:pPr>
+              <w:spacing w:before="0" w:after="0" w:line="276" w:lineRule="auto"/>
+            </w:pPr>
+            <w:r>
+              <w:rPr>
+                <w:rFonts w:ascii="Calibri" w:hAnsi="Calibri"/>
+                <w:b/>
+                <w:color w:val="1E293B"/>
+                <w:sz w:val="19"/>
+              </w:rPr>
+              <w:t>Avance de Proyecto Final 3 (APF3)</w:t>
+            </w:r>
+          </w:p>
+        </w:tc>
+        <w:tc>
+          <w:tcPr>
+            <w:tcW w:type="dxa" w:w="1560"/>
+            <w:vAlign w:val="center"/>
+            <w:tcMar>
+              <w:top w:w="120" w:type="dxa"/>
+              <w:bottom w:w="120" w:type="dxa"/>
+              <w:left w:w="150" w:type="dxa"/>
+              <w:right w:w="150" w:type="dxa"/>
+            </w:tcMar>
+          </w:tcPr>
+          <w:p>
+            <w:pPr>
+              <w:spacing w:before="0" w:after="0" w:line="276" w:lineRule="auto"/>
+            </w:pPr>
+            <w:r>
+              <w:rPr>
+                <w:rFonts w:ascii="Calibri" w:hAnsi="Calibri"/>
+                <w:color w:val="1E293B"/>
+                <w:sz w:val="19"/>
+              </w:rPr>
+              <w:t>S14</w:t>
+            </w:r>
+          </w:p>
+        </w:tc>
+        <w:tc>
+          <w:tcPr>
+            <w:tcW w:type="dxa" w:w="1560"/>
+            <w:vAlign w:val="center"/>
+            <w:tcMar>
+              <w:top w:w="120" w:type="dxa"/>
+              <w:bottom w:w="120" w:type="dxa"/>
+              <w:left w:w="150" w:type="dxa"/>
+              <w:right w:w="150" w:type="dxa"/>
+            </w:tcMar>
+          </w:tcPr>
+          <w:p>
+            <w:pPr>
+              <w:spacing w:before="0" w:after="0" w:line="276" w:lineRule="auto"/>
+            </w:pPr>
+            <w:r>
+              <w:rPr>
+                <w:rFonts w:ascii="Calibri" w:hAnsi="Calibri"/>
+                <w:color w:val="1E293B"/>
+                <w:sz w:val="19"/>
+              </w:rPr>
               <w:t>Planificado (Sprint 4)</w:t>
             </w:r>
           </w:p>
         </w:tc>
         <w:tc>
           <w:tcPr>
-            <w:tcW w:type="dxa" w:w="1872"/>
+            <w:tcW w:type="dxa" w:w="1560"/>
+            <w:vAlign w:val="center"/>
+            <w:tcMar>
+              <w:top w:w="120" w:type="dxa"/>
+              <w:bottom w:w="120" w:type="dxa"/>
+              <w:left w:w="150" w:type="dxa"/>
+              <w:right w:w="150" w:type="dxa"/>
+            </w:tcMar>
+          </w:tcPr>
+          <w:p>
+            <w:pPr>
+              <w:spacing w:before="0" w:after="0" w:line="276" w:lineRule="auto"/>
+            </w:pPr>
+            <w:r>
+              <w:rPr>
+                <w:rFonts w:ascii="Calibri" w:hAnsi="Calibri"/>
+                <w:i/>
+                <w:color w:val="1E293B"/>
+                <w:sz w:val="19"/>
+              </w:rPr>
+              <w:t>En desarrollo para Semana 14</w:t>
+            </w:r>
+          </w:p>
+        </w:tc>
+        <w:tc>
+          <w:tcPr>
+            <w:tcW w:type="dxa" w:w="1560"/>
+            <w:vAlign w:val="center"/>
+            <w:tcMar>
+              <w:top w:w="120" w:type="dxa"/>
+              <w:bottom w:w="120" w:type="dxa"/>
+              <w:left w:w="150" w:type="dxa"/>
+              <w:right w:w="150" w:type="dxa"/>
+            </w:tcMar>
+          </w:tcPr>
+          <w:p>
+            <w:pPr>
+              <w:spacing w:before="0" w:after="0" w:line="276" w:lineRule="auto"/>
+            </w:pPr>
+            <w:r>
+              <w:rPr>
+                <w:rFonts w:ascii="Calibri" w:hAnsi="Calibri"/>
+                <w:i/>
+                <w:color w:val="1E293B"/>
+                <w:sz w:val="19"/>
+              </w:rPr>
+              <w:t>En desarrollo para Semana 14</w:t>
+            </w:r>
+          </w:p>
+        </w:tc>
+        <w:tc>
+          <w:tcPr>
+            <w:tcW w:type="dxa" w:w="1560"/>
+            <w:vAlign w:val="center"/>
+            <w:tcMar>
+              <w:top w:w="120" w:type="dxa"/>
+              <w:bottom w:w="120" w:type="dxa"/>
+              <w:left w:w="150" w:type="dxa"/>
+              <w:right w:w="150" w:type="dxa"/>
+            </w:tcMar>
+          </w:tcPr>
+          <w:p>
+            <w:pPr>
+              <w:spacing w:before="0" w:after="0" w:line="276" w:lineRule="auto"/>
+            </w:pPr>
+            <w:r>
+              <w:rPr>
+                <w:rFonts w:ascii="Calibri" w:hAnsi="Calibri"/>
+                <w:color w:val="1E293B"/>
+                <w:sz w:val="19"/>
+              </w:rPr>
+              <w:t>—</w:t>
+            </w:r>
+          </w:p>
+        </w:tc>
+      </w:tr>
+      <w:tr>
+        <w:trPr>
+          <w:trHeight w:val="280"/>
+        </w:trPr>
+        <w:tc>
+          <w:tcPr>
+            <w:tcW w:type="dxa" w:w="1560"/>
+            <w:vAlign w:val="center"/>
+            <w:tcMar>
+              <w:top w:w="120" w:type="dxa"/>
+              <w:bottom w:w="120" w:type="dxa"/>
+              <w:left w:w="150" w:type="dxa"/>
+              <w:right w:w="150" w:type="dxa"/>
+            </w:tcMar>
+            <w:shd w:fill="F8FAFC"/>
+          </w:tcPr>
+          <w:p>
+            <w:pPr>
+              <w:spacing w:before="0" w:after="0" w:line="276" w:lineRule="auto"/>
+            </w:pPr>
+            <w:r>
+              <w:rPr>
+                <w:rFonts w:ascii="Calibri" w:hAnsi="Calibri"/>
+                <w:b/>
+                <w:color w:val="1E293B"/>
+                <w:sz w:val="19"/>
+              </w:rPr>
+              <w:t>Evaluación Final (PROY)</w:t>
+            </w:r>
+          </w:p>
+        </w:tc>
+        <w:tc>
+          <w:tcPr>
+            <w:tcW w:type="dxa" w:w="1560"/>
+            <w:vAlign w:val="center"/>
+            <w:tcMar>
+              <w:top w:w="120" w:type="dxa"/>
+              <w:bottom w:w="120" w:type="dxa"/>
+              <w:left w:w="150" w:type="dxa"/>
+              <w:right w:w="150" w:type="dxa"/>
+            </w:tcMar>
+            <w:shd w:fill="F8FAFC"/>
+          </w:tcPr>
+          <w:p>
+            <w:pPr>
+              <w:spacing w:before="0" w:after="0" w:line="276" w:lineRule="auto"/>
+            </w:pPr>
+            <w:r>
+              <w:rPr>
+                <w:rFonts w:ascii="Calibri" w:hAnsi="Calibri"/>
+                <w:color w:val="1E293B"/>
+                <w:sz w:val="19"/>
+              </w:rPr>
+              <w:t>S18</w:t>
+            </w:r>
+          </w:p>
+        </w:tc>
+        <w:tc>
+          <w:tcPr>
+            <w:tcW w:type="dxa" w:w="1560"/>
+            <w:vAlign w:val="center"/>
+            <w:tcMar>
+              <w:top w:w="120" w:type="dxa"/>
+              <w:bottom w:w="120" w:type="dxa"/>
+              <w:left w:w="150" w:type="dxa"/>
+              <w:right w:w="150" w:type="dxa"/>
+            </w:tcMar>
+            <w:shd w:fill="F8FAFC"/>
+          </w:tcPr>
+          <w:p>
+            <w:pPr>
+              <w:spacing w:before="0" w:after="0" w:line="276" w:lineRule="auto"/>
+            </w:pPr>
+            <w:r>
+              <w:rPr>
+                <w:rFonts w:ascii="Calibri" w:hAnsi="Calibri"/>
+                <w:color w:val="1E293B"/>
+                <w:sz w:val="19"/>
+              </w:rPr>
+              <w:t>Planificado (Sprint 5)</w:t>
+            </w:r>
+          </w:p>
+        </w:tc>
+        <w:tc>
+          <w:tcPr>
+            <w:tcW w:type="dxa" w:w="1560"/>
             <w:vAlign w:val="center"/>
             <w:tcMar>
               <w:top w:w="120" w:type="dxa"/>
@@ -850,13 +1170,13 @@
                 <w:color w:val="1E293B"/>
                 <w:sz w:val="19"/>
               </w:rPr>
-              <w:t>En desarrollo para Semana 13</w:t>
+              <w:t>En desarrollo para Semana 18</w:t>
             </w:r>
           </w:p>
         </w:tc>
         <w:tc>
           <w:tcPr>
-            <w:tcW w:type="dxa" w:w="1872"/>
+            <w:tcW w:type="dxa" w:w="1560"/>
             <w:vAlign w:val="center"/>
             <w:tcMar>
               <w:top w:w="120" w:type="dxa"/>
@@ -877,18 +1197,13 @@
                 <w:color w:val="1E293B"/>
                 <w:sz w:val="19"/>
               </w:rPr>
-              <w:t>En desarrollo para Semana 13</w:t>
+              <w:t>En desarrollo para Semana 18</w:t>
             </w:r>
           </w:p>
         </w:tc>
-      </w:tr>
-      <w:tr>
-        <w:trPr>
-          <w:trHeight w:val="280"/>
-        </w:trPr>
         <w:tc>
           <w:tcPr>
-            <w:tcW w:type="dxa" w:w="1872"/>
+            <w:tcW w:type="dxa" w:w="1560"/>
             <w:vAlign w:val="center"/>
             <w:tcMar>
               <w:top w:w="120" w:type="dxa"/>
@@ -896,32 +1211,7 @@
               <w:left w:w="150" w:type="dxa"/>
               <w:right w:w="150" w:type="dxa"/>
             </w:tcMar>
-          </w:tcPr>
-          <w:p>
-            <w:pPr>
-              <w:spacing w:before="0" w:after="0" w:line="276" w:lineRule="auto"/>
-            </w:pPr>
-            <w:r>
-              <w:rPr>
-                <w:rFonts w:ascii="Calibri" w:hAnsi="Calibri"/>
-                <w:b/>
-                <w:color w:val="1E293B"/>
-                <w:sz w:val="19"/>
-              </w:rPr>
-              <w:t>PROY (Final)</w:t>
-            </w:r>
-          </w:p>
-        </w:tc>
-        <w:tc>
-          <w:tcPr>
-            <w:tcW w:type="dxa" w:w="1872"/>
-            <w:vAlign w:val="center"/>
-            <w:tcMar>
-              <w:top w:w="120" w:type="dxa"/>
-              <w:bottom w:w="120" w:type="dxa"/>
-              <w:left w:w="150" w:type="dxa"/>
-              <w:right w:w="150" w:type="dxa"/>
-            </w:tcMar>
+            <w:shd w:fill="F8FAFC"/>
           </w:tcPr>
           <w:p>
             <w:pPr>
@@ -933,84 +1223,7 @@
                 <w:color w:val="1E293B"/>
                 <w:sz w:val="19"/>
               </w:rPr>
-              <w:t>Semana 18</w:t>
-            </w:r>
-          </w:p>
-        </w:tc>
-        <w:tc>
-          <w:tcPr>
-            <w:tcW w:type="dxa" w:w="1872"/>
-            <w:vAlign w:val="center"/>
-            <w:tcMar>
-              <w:top w:w="120" w:type="dxa"/>
-              <w:bottom w:w="120" w:type="dxa"/>
-              <w:left w:w="150" w:type="dxa"/>
-              <w:right w:w="150" w:type="dxa"/>
-            </w:tcMar>
-          </w:tcPr>
-          <w:p>
-            <w:pPr>
-              <w:spacing w:before="0" w:after="0" w:line="276" w:lineRule="auto"/>
-            </w:pPr>
-            <w:r>
-              <w:rPr>
-                <w:rFonts w:ascii="Calibri" w:hAnsi="Calibri"/>
-                <w:color w:val="1E293B"/>
-                <w:sz w:val="19"/>
-              </w:rPr>
-              <w:t>Planificado (Sprint 5)</w:t>
-            </w:r>
-          </w:p>
-        </w:tc>
-        <w:tc>
-          <w:tcPr>
-            <w:tcW w:type="dxa" w:w="1872"/>
-            <w:vAlign w:val="center"/>
-            <w:tcMar>
-              <w:top w:w="120" w:type="dxa"/>
-              <w:bottom w:w="120" w:type="dxa"/>
-              <w:left w:w="150" w:type="dxa"/>
-              <w:right w:w="150" w:type="dxa"/>
-            </w:tcMar>
-          </w:tcPr>
-          <w:p>
-            <w:pPr>
-              <w:spacing w:before="0" w:after="0" w:line="276" w:lineRule="auto"/>
-            </w:pPr>
-            <w:r>
-              <w:rPr>
-                <w:rFonts w:ascii="Calibri" w:hAnsi="Calibri"/>
-                <w:i/>
-                <w:color w:val="1E293B"/>
-                <w:sz w:val="19"/>
-              </w:rPr>
-              <w:t>En desarrollo para Semana 18</w:t>
-            </w:r>
-          </w:p>
-        </w:tc>
-        <w:tc>
-          <w:tcPr>
-            <w:tcW w:type="dxa" w:w="1872"/>
-            <w:vAlign w:val="center"/>
-            <w:tcMar>
-              <w:top w:w="120" w:type="dxa"/>
-              <w:bottom w:w="120" w:type="dxa"/>
-              <w:left w:w="150" w:type="dxa"/>
-              <w:right w:w="150" w:type="dxa"/>
-            </w:tcMar>
-          </w:tcPr>
-          <w:p>
-            <w:pPr>
-              <w:spacing w:before="0" w:after="0" w:line="276" w:lineRule="auto"/>
-            </w:pPr>
-            <w:r>
-              <w:rPr>
-                <w:rFonts w:ascii="Calibri" w:hAnsi="Calibri"/>
-                <w:i/>
-                <w:color w:val="1E293B"/>
-                <w:sz w:val="19"/>
-              </w:rPr>
-              <w:t>En desarrollo para Semana 18</w:t>
+              <w:t>—</w:t>
             </w:r>
           </w:p>
         </w:tc>

</xml_diff>

<commit_message>
docs(structure): centralizar y organizar toda la documentacion en subdirectorios formales dentro de docs/
</commit_message>
<xml_diff>
--- a/docs/README.docx
+++ b/docs/README.docx
@@ -136,7 +136,7 @@
         <w:br/>
         <w:t>│</w:t>
         <w:br/>
-        <w:t>├── Entregables Oficiales por Hito de Evaluación:</w:t>
+        <w:t>├── entregas_academicas/                # Entregables Oficiales y Gobernanza:</w:t>
         <w:br/>
         <w:t>│   ├── INFORME_FINAL_APF2_LEOFIT.pdf       # Entregable Oficial Maestro APF2 (PDF)</w:t>
         <w:br/>
@@ -182,7 +182,7 @@
         <w:br/>
         <w:t>│</w:t>
         <w:br/>
-        <w:t>└── Anexos Especializados de Ingeniería (Formatos MD / DOCX / PDF):</w:t>
+        <w:t>└── modulos_tecnicos/                  # Anexos Especializados de Ingeniería (01 al 13):</w:t>
         <w:br/>
         <w:t xml:space="preserve">    ├── 01_Ficha_Identificacion         # Ficha institucional de identificación del proyecto</w:t>
         <w:br/>
@@ -672,7 +672,7 @@
                 <w:color w:val="1E293B"/>
                 <w:sz w:val="19"/>
               </w:rPr>
-              <w:t>[Descargar .docx](./INFORME_FINAL_APF2_LEOFIT.docx)</w:t>
+              <w:t>[Descargar .docx](./entregas_academicas/INFORME_FINAL_APF2_LEOFIT.docx)</w:t>
             </w:r>
           </w:p>
         </w:tc>
@@ -697,7 +697,7 @@
                 <w:color w:val="1E293B"/>
                 <w:sz w:val="19"/>
               </w:rPr>
-              <w:t>[Descargar .pdf](./INFORME_FINAL_APF2_LEOFIT.pdf)</w:t>
+              <w:t>[Descargar .pdf](./entregas_academicas/INFORME_FINAL_APF2_LEOFIT.pdf)</w:t>
             </w:r>
           </w:p>
         </w:tc>
@@ -849,7 +849,7 @@
                 <w:color w:val="1E293B"/>
                 <w:sz w:val="19"/>
               </w:rPr>
-              <w:t>[Descargar .docx](./INFORME_FINAL_APF1_LEOFIT.docx)</w:t>
+              <w:t>[Descargar .docx](./entregas_academicas/INFORME_FINAL_APF1_LEOFIT.docx)</w:t>
             </w:r>
           </w:p>
         </w:tc>
@@ -875,7 +875,7 @@
                 <w:color w:val="1E293B"/>
                 <w:sz w:val="19"/>
               </w:rPr>
-              <w:t>[Descargar .pdf](./INFORME_FINAL_APF1_LEOFIT.pdf)</w:t>
+              <w:t>[Descargar .pdf](./entregas_academicas/INFORME_FINAL_APF1_LEOFIT.pdf)</w:t>
             </w:r>
           </w:p>
         </w:tc>
@@ -901,7 +901,7 @@
                 <w:color w:val="1E293B"/>
                 <w:sz w:val="19"/>
               </w:rPr>
-              <w:t>[Ver .md](./INFORME_FINAL_APF1_LEOFIT.md)</w:t>
+              <w:t>[Ver .md](./entregas_academicas/INFORME_FINAL_APF1_LEOFIT.md)</w:t>
             </w:r>
           </w:p>
         </w:tc>

</xml_diff>

<commit_message>
docs(cleanup): depurar plantillas genericas y duplicados, consolidando acta 01, glosario y 35 pruebas en documento maestro
</commit_message>
<xml_diff>
--- a/docs/README.docx
+++ b/docs/README.docx
@@ -168,17 +168,9 @@
         <w:br/>
         <w:t>│   ├── evaluaciones/                   # Retroalimentación oficial de notas UTP</w:t>
         <w:br/>
-        <w:t>│   └── recursos/                       # Plantillas institucionales y recursos UTP:</w:t>
+        <w:t>│   └── recursos/                       # Documentación institucional y recursos UTP:</w:t>
         <w:br/>
-        <w:t>│       ├── Checklist_Integral_Evaluacion_Software_Plantilla.docx # Plantilla base de evaluación de software</w:t>
-        <w:br/>
-        <w:t>│       ├── Ficha_Mapeo_Empresa_Semana_1.pdf                      # Ficha de mapeo empresarial</w:t>
-        <w:br/>
-        <w:t>│       ├── Ficha_Mapeo_Original.pdf                              # Ficha original de contacto y levantamiento</w:t>
-        <w:br/>
-        <w:t>│       ├── UTP_Semana_2_ASIS_TOBE_Plantilla.pptx                 # Plantilla de diagramas AS-IS / TO-BE</w:t>
-        <w:br/>
-        <w:t>│       └── UTP_Semana_2_Requerimientos_Plantilla.xlsx            # Matriz de requerimientos</w:t>
+        <w:t>│       └── Ficha_Mapeo_Empresa_Semana_1.pdf # Ficha oficial de mapeo empresarial suscrita</w:t>
         <w:br/>
         <w:t>│</w:t>
         <w:br/>
@@ -1471,7 +1463,7 @@
                 <w:color w:val="1E293B"/>
                 <w:sz w:val="19"/>
               </w:rPr>
-              <w:t>](Checklist_Integral_Evaluacion_Software.md)</w:t>
+              <w:t>](./entregas_academicas/Checklist_Integral_Evaluacion_Software.md)</w:t>
             </w:r>
           </w:p>
         </w:tc>
@@ -1513,7 +1505,7 @@
                 <w:color w:val="1E293B"/>
                 <w:sz w:val="19"/>
               </w:rPr>
-              <w:t>](Checklist_Integral_Evaluacion_Software.docx)</w:t>
+              <w:t>](./entregas_academicas/Checklist_Integral_Evaluacion_Software.docx)</w:t>
             </w:r>
           </w:p>
         </w:tc>
@@ -1555,7 +1547,7 @@
                 <w:color w:val="1E293B"/>
                 <w:sz w:val="19"/>
               </w:rPr>
-              <w:t>](Checklist_Integral_Evaluacion_Software.pdf)</w:t>
+              <w:t>](./entregas_academicas/Checklist_Integral_Evaluacion_Software.pdf)</w:t>
             </w:r>
           </w:p>
         </w:tc>
@@ -1653,7 +1645,7 @@
                 <w:color w:val="1E293B"/>
                 <w:sz w:val="19"/>
               </w:rPr>
-              <w:t>](GUIA_CARGA_ISSUES_GITHUB.md)</w:t>
+              <w:t>](./entregas_academicas/GUIA_CARGA_ISSUES_GITHUB.md)</w:t>
             </w:r>
           </w:p>
         </w:tc>
@@ -1694,7 +1686,7 @@
                 <w:color w:val="1E293B"/>
                 <w:sz w:val="19"/>
               </w:rPr>
-              <w:t>](GUIA_CARGA_ISSUES_GITHUB.docx)</w:t>
+              <w:t>](./entregas_academicas/GUIA_CARGA_ISSUES_GITHUB.docx)</w:t>
             </w:r>
           </w:p>
         </w:tc>
@@ -1735,7 +1727,7 @@
                 <w:color w:val="1E293B"/>
                 <w:sz w:val="19"/>
               </w:rPr>
-              <w:t>](GUIA_CARGA_ISSUES_GITHUB.pdf)</w:t>
+              <w:t>](./entregas_academicas/GUIA_CARGA_ISSUES_GITHUB.pdf)</w:t>
             </w:r>
           </w:p>
         </w:tc>
@@ -1834,7 +1826,7 @@
                 <w:color w:val="1E293B"/>
                 <w:sz w:val="19"/>
               </w:rPr>
-              <w:t>](PLAN_ACADEMICO_GITHUB_PROJECTS_LEOFIT.md)</w:t>
+              <w:t>](./entregas_academicas/PLAN_ACADEMICO_GITHUB_PROJECTS_LEOFIT.md)</w:t>
             </w:r>
           </w:p>
         </w:tc>
@@ -1876,7 +1868,7 @@
                 <w:color w:val="1E293B"/>
                 <w:sz w:val="19"/>
               </w:rPr>
-              <w:t>](PLAN_ACADEMICO_GITHUB_PROJECTS_LEOFIT.docx)</w:t>
+              <w:t>](./entregas_academicas/PLAN_ACADEMICO_GITHUB_PROJECTS_LEOFIT.docx)</w:t>
             </w:r>
           </w:p>
         </w:tc>
@@ -1918,7 +1910,7 @@
                 <w:color w:val="1E293B"/>
                 <w:sz w:val="19"/>
               </w:rPr>
-              <w:t>](PLAN_ACADEMICO_GITHUB_PROJECTS_LEOFIT.pdf)</w:t>
+              <w:t>](./entregas_academicas/PLAN_ACADEMICO_GITHUB_PROJECTS_LEOFIT.pdf)</w:t>
             </w:r>
           </w:p>
         </w:tc>
@@ -2247,7 +2239,7 @@
                 <w:color w:val="1E293B"/>
                 <w:sz w:val="19"/>
               </w:rPr>
-              <w:t>](01_Ficha_Identificacion.md)</w:t>
+              <w:t>](./modulos_tecnicos/01_Ficha_Identificacion.md)</w:t>
             </w:r>
           </w:p>
         </w:tc>
@@ -2289,7 +2281,7 @@
                 <w:color w:val="1E293B"/>
                 <w:sz w:val="19"/>
               </w:rPr>
-              <w:t>](01_Ficha_Identificacion.docx)</w:t>
+              <w:t>](./modulos_tecnicos/01_Ficha_Identificacion.docx)</w:t>
             </w:r>
           </w:p>
         </w:tc>
@@ -2331,7 +2323,7 @@
                 <w:color w:val="1E293B"/>
                 <w:sz w:val="19"/>
               </w:rPr>
-              <w:t>](01_Ficha_Identificacion.pdf)</w:t>
+              <w:t>](./modulos_tecnicos/01_Ficha_Identificacion.pdf)</w:t>
             </w:r>
           </w:p>
         </w:tc>
@@ -2455,7 +2447,7 @@
                 <w:color w:val="1E293B"/>
                 <w:sz w:val="19"/>
               </w:rPr>
-              <w:t>](02_Requerimientos.md)</w:t>
+              <w:t>](./modulos_tecnicos/02_Requerimientos.md)</w:t>
             </w:r>
           </w:p>
         </w:tc>
@@ -2496,7 +2488,7 @@
                 <w:color w:val="1E293B"/>
                 <w:sz w:val="19"/>
               </w:rPr>
-              <w:t>](02_Requerimientos.docx)</w:t>
+              <w:t>](./modulos_tecnicos/02_Requerimientos.docx)</w:t>
             </w:r>
           </w:p>
         </w:tc>
@@ -2537,7 +2529,7 @@
                 <w:color w:val="1E293B"/>
                 <w:sz w:val="19"/>
               </w:rPr>
-              <w:t>](02_Requerimientos.pdf)</w:t>
+              <w:t>](./modulos_tecnicos/02_Requerimientos.pdf)</w:t>
             </w:r>
           </w:p>
         </w:tc>
@@ -2663,7 +2655,7 @@
                 <w:color w:val="1E293B"/>
                 <w:sz w:val="19"/>
               </w:rPr>
-              <w:t>](03_Acta_Reunion_1.md)</w:t>
+              <w:t>](./modulos_tecnicos/03_Acta_Reunion_1.md)</w:t>
             </w:r>
           </w:p>
         </w:tc>
@@ -2705,7 +2697,7 @@
                 <w:color w:val="1E293B"/>
                 <w:sz w:val="19"/>
               </w:rPr>
-              <w:t>](03_Acta_Reunion_1.docx)</w:t>
+              <w:t>](./modulos_tecnicos/03_Acta_Reunion_1.docx)</w:t>
             </w:r>
           </w:p>
         </w:tc>
@@ -2747,7 +2739,7 @@
                 <w:color w:val="1E293B"/>
                 <w:sz w:val="19"/>
               </w:rPr>
-              <w:t>](03_Acta_Reunion_1.pdf)</w:t>
+              <w:t>](./modulos_tecnicos/03_Acta_Reunion_1.pdf)</w:t>
             </w:r>
           </w:p>
         </w:tc>
@@ -2871,7 +2863,7 @@
                 <w:color w:val="1E293B"/>
                 <w:sz w:val="19"/>
               </w:rPr>
-              <w:t>](04_Glosario.md)</w:t>
+              <w:t>](./modulos_tecnicos/04_Glosario.md)</w:t>
             </w:r>
           </w:p>
         </w:tc>
@@ -2912,7 +2904,7 @@
                 <w:color w:val="1E293B"/>
                 <w:sz w:val="19"/>
               </w:rPr>
-              <w:t>](04_Glosario.docx)</w:t>
+              <w:t>](./modulos_tecnicos/04_Glosario.docx)</w:t>
             </w:r>
           </w:p>
         </w:tc>
@@ -2953,7 +2945,7 @@
                 <w:color w:val="1E293B"/>
                 <w:sz w:val="19"/>
               </w:rPr>
-              <w:t>](04_Glosario.pdf)</w:t>
+              <w:t>](./modulos_tecnicos/04_Glosario.pdf)</w:t>
             </w:r>
           </w:p>
         </w:tc>
@@ -3079,7 +3071,7 @@
                 <w:color w:val="1E293B"/>
                 <w:sz w:val="19"/>
               </w:rPr>
-              <w:t>](05_Preguntas_Criticas_Panel.md)</w:t>
+              <w:t>](./modulos_tecnicos/05_Preguntas_Criticas_Panel.md)</w:t>
             </w:r>
           </w:p>
         </w:tc>
@@ -3121,7 +3113,7 @@
                 <w:color w:val="1E293B"/>
                 <w:sz w:val="19"/>
               </w:rPr>
-              <w:t>](05_Preguntas_Criticas_Panel.docx)</w:t>
+              <w:t>](./modulos_tecnicos/05_Preguntas_Criticas_Panel.docx)</w:t>
             </w:r>
           </w:p>
         </w:tc>
@@ -3163,7 +3155,7 @@
                 <w:color w:val="1E293B"/>
                 <w:sz w:val="19"/>
               </w:rPr>
-              <w:t>](05_Preguntas_Criticas_Panel.pdf)</w:t>
+              <w:t>](./modulos_tecnicos/05_Preguntas_Criticas_Panel.pdf)</w:t>
             </w:r>
           </w:p>
         </w:tc>
@@ -3287,7 +3279,7 @@
                 <w:color w:val="1E293B"/>
                 <w:sz w:val="19"/>
               </w:rPr>
-              <w:t>](06_Especificacion_PWA_Prompt.md)</w:t>
+              <w:t>](./modulos_tecnicos/06_Especificacion_PWA_Prompt.md)</w:t>
             </w:r>
           </w:p>
         </w:tc>
@@ -3328,7 +3320,7 @@
                 <w:color w:val="1E293B"/>
                 <w:sz w:val="19"/>
               </w:rPr>
-              <w:t>](06_Especificacion_PWA_Prompt.docx)</w:t>
+              <w:t>](./modulos_tecnicos/06_Especificacion_PWA_Prompt.docx)</w:t>
             </w:r>
           </w:p>
         </w:tc>
@@ -3369,7 +3361,7 @@
                 <w:color w:val="1E293B"/>
                 <w:sz w:val="19"/>
               </w:rPr>
-              <w:t>](06_Especificacion_PWA_Prompt.pdf)</w:t>
+              <w:t>](./modulos_tecnicos/06_Especificacion_PWA_Prompt.pdf)</w:t>
             </w:r>
           </w:p>
         </w:tc>
@@ -3495,7 +3487,7 @@
                 <w:color w:val="1E293B"/>
                 <w:sz w:val="19"/>
               </w:rPr>
-              <w:t>](07_Arquitectura_Sistema.md)</w:t>
+              <w:t>](./modulos_tecnicos/07_Arquitectura_Sistema.md)</w:t>
             </w:r>
           </w:p>
         </w:tc>
@@ -3537,7 +3529,7 @@
                 <w:color w:val="1E293B"/>
                 <w:sz w:val="19"/>
               </w:rPr>
-              <w:t>](07_Arquitectura_Sistema.docx)</w:t>
+              <w:t>](./modulos_tecnicos/07_Arquitectura_Sistema.docx)</w:t>
             </w:r>
           </w:p>
         </w:tc>
@@ -3579,7 +3571,7 @@
                 <w:color w:val="1E293B"/>
                 <w:sz w:val="19"/>
               </w:rPr>
-              <w:t>](07_Arquitectura_Sistema.pdf)</w:t>
+              <w:t>](./modulos_tecnicos/07_Arquitectura_Sistema.pdf)</w:t>
             </w:r>
           </w:p>
         </w:tc>
@@ -3703,7 +3695,7 @@
                 <w:color w:val="1E293B"/>
                 <w:sz w:val="19"/>
               </w:rPr>
-              <w:t>](08_Normalizacion_Base_Datos.md)</w:t>
+              <w:t>](./modulos_tecnicos/08_Normalizacion_Base_Datos.md)</w:t>
             </w:r>
           </w:p>
         </w:tc>
@@ -3744,7 +3736,7 @@
                 <w:color w:val="1E293B"/>
                 <w:sz w:val="19"/>
               </w:rPr>
-              <w:t>](08_Normalizacion_Base_Datos.docx)</w:t>
+              <w:t>](./modulos_tecnicos/08_Normalizacion_Base_Datos.docx)</w:t>
             </w:r>
           </w:p>
         </w:tc>
@@ -3785,7 +3777,7 @@
                 <w:color w:val="1E293B"/>
                 <w:sz w:val="19"/>
               </w:rPr>
-              <w:t>](08_Normalizacion_Base_Datos.pdf)</w:t>
+              <w:t>](./modulos_tecnicos/08_Normalizacion_Base_Datos.pdf)</w:t>
             </w:r>
           </w:p>
         </w:tc>
@@ -3911,7 +3903,7 @@
                 <w:color w:val="1E293B"/>
                 <w:sz w:val="19"/>
               </w:rPr>
-              <w:t>](09_Guion_Video_Demo_Remotion.md)</w:t>
+              <w:t>](./modulos_tecnicos/09_Guion_Video_Demo_Remotion.md)</w:t>
             </w:r>
           </w:p>
         </w:tc>
@@ -3953,7 +3945,7 @@
                 <w:color w:val="1E293B"/>
                 <w:sz w:val="19"/>
               </w:rPr>
-              <w:t>](09_Guion_Video_Demo_Remotion.docx)</w:t>
+              <w:t>](./modulos_tecnicos/09_Guion_Video_Demo_Remotion.docx)</w:t>
             </w:r>
           </w:p>
         </w:tc>
@@ -3995,7 +3987,7 @@
                 <w:color w:val="1E293B"/>
                 <w:sz w:val="19"/>
               </w:rPr>
-              <w:t>](09_Guion_Video_Demo_Remotion.pdf)</w:t>
+              <w:t>](./modulos_tecnicos/09_Guion_Video_Demo_Remotion.pdf)</w:t>
             </w:r>
           </w:p>
         </w:tc>
@@ -4119,7 +4111,7 @@
                 <w:color w:val="1E293B"/>
                 <w:sz w:val="19"/>
               </w:rPr>
-              <w:t>](10_Catalogo_Controles_Seguridad_OWASP.md)</w:t>
+              <w:t>](./modulos_tecnicos/10_Catalogo_Controles_Seguridad_OWASP.md)</w:t>
             </w:r>
           </w:p>
         </w:tc>
@@ -4160,7 +4152,7 @@
                 <w:color w:val="1E293B"/>
                 <w:sz w:val="19"/>
               </w:rPr>
-              <w:t>](10_Catalogo_Controles_Seguridad_OWASP.docx)</w:t>
+              <w:t>](./modulos_tecnicos/10_Catalogo_Controles_Seguridad_OWASP.docx)</w:t>
             </w:r>
           </w:p>
         </w:tc>
@@ -4201,7 +4193,7 @@
                 <w:color w:val="1E293B"/>
                 <w:sz w:val="19"/>
               </w:rPr>
-              <w:t>](10_Catalogo_Controles_Seguridad_OWASP.pdf)</w:t>
+              <w:t>](./modulos_tecnicos/10_Catalogo_Controles_Seguridad_OWASP.pdf)</w:t>
             </w:r>
           </w:p>
         </w:tc>
@@ -4327,7 +4319,7 @@
                 <w:color w:val="1E293B"/>
                 <w:sz w:val="19"/>
               </w:rPr>
-              <w:t>](11_Informe_Seguridad_Cifrado_Pruebas_Web.md)</w:t>
+              <w:t>](./modulos_tecnicos/11_Informe_Seguridad_Cifrado_Pruebas_Web.md)</w:t>
             </w:r>
           </w:p>
         </w:tc>
@@ -4369,7 +4361,7 @@
                 <w:color w:val="1E293B"/>
                 <w:sz w:val="19"/>
               </w:rPr>
-              <w:t>](11_Informe_Seguridad_Cifrado_Pruebas_Web.docx)</w:t>
+              <w:t>](./modulos_tecnicos/11_Informe_Seguridad_Cifrado_Pruebas_Web.docx)</w:t>
             </w:r>
           </w:p>
         </w:tc>
@@ -4411,7 +4403,7 @@
                 <w:color w:val="1E293B"/>
                 <w:sz w:val="19"/>
               </w:rPr>
-              <w:t>](11_Informe_Seguridad_Cifrado_Pruebas_Web.pdf)</w:t>
+              <w:t>](./modulos_tecnicos/11_Informe_Seguridad_Cifrado_Pruebas_Web.pdf)</w:t>
             </w:r>
           </w:p>
         </w:tc>
@@ -4551,7 +4543,7 @@
                 <w:color w:val="1E293B"/>
                 <w:sz w:val="19"/>
               </w:rPr>
-              <w:t>](12_Manual_Despliegue_Cloud_Produccion.md)</w:t>
+              <w:t>](./modulos_tecnicos/12_Manual_Despliegue_Cloud_Produccion.md)</w:t>
             </w:r>
           </w:p>
         </w:tc>
@@ -4592,7 +4584,7 @@
                 <w:color w:val="1E293B"/>
                 <w:sz w:val="19"/>
               </w:rPr>
-              <w:t>](12_Manual_Despliegue_Cloud_Produccion.docx)</w:t>
+              <w:t>](./modulos_tecnicos/12_Manual_Despliegue_Cloud_Produccion.docx)</w:t>
             </w:r>
           </w:p>
         </w:tc>
@@ -4633,7 +4625,7 @@
                 <w:color w:val="1E293B"/>
                 <w:sz w:val="19"/>
               </w:rPr>
-              <w:t>](12_Manual_Despliegue_Cloud_Produccion.pdf)</w:t>
+              <w:t>](./modulos_tecnicos/12_Manual_Despliegue_Cloud_Produccion.pdf)</w:t>
             </w:r>
           </w:p>
         </w:tc>
@@ -4759,7 +4751,7 @@
                 <w:color w:val="1E293B"/>
                 <w:sz w:val="19"/>
               </w:rPr>
-              <w:t>](13_Evidencia_Cumplimiento_Requerimientos_Software.md)</w:t>
+              <w:t>](./modulos_tecnicos/13_Evidencia_Cumplimiento_Requerimientos_Software.md)</w:t>
             </w:r>
           </w:p>
         </w:tc>
@@ -4801,7 +4793,7 @@
                 <w:color w:val="1E293B"/>
                 <w:sz w:val="19"/>
               </w:rPr>
-              <w:t>](13_Evidencia_Cumplimiento_Requerimientos_Software.docx)</w:t>
+              <w:t>](./modulos_tecnicos/13_Evidencia_Cumplimiento_Requerimientos_Software.docx)</w:t>
             </w:r>
           </w:p>
         </w:tc>
@@ -4843,7 +4835,7 @@
                 <w:color w:val="1E293B"/>
                 <w:sz w:val="19"/>
               </w:rPr>
-              <w:t>](13_Evidencia_Cumplimiento_Requerimientos_Software.pdf)</w:t>
+              <w:t>](./modulos_tecnicos/13_Evidencia_Cumplimiento_Requerimientos_Software.pdf)</w:t>
             </w:r>
           </w:p>
         </w:tc>
@@ -4892,7 +4884,7 @@
           <w:color w:val="F97316"/>
           <w:sz w:val="28"/>
         </w:rPr>
-        <w:t>3. Políticas de Seguridad y Manejo de Información Sensible</w:t>
+        <w:t>4. Políticas de Seguridad y Manejo de Información Sensible</w:t>
       </w:r>
     </w:p>
     <w:p>

</xml_diff>